<commit_message>
added new idea to design
</commit_message>
<xml_diff>
--- a/Misc/design.docx
+++ b/Misc/design.docx
@@ -1,6 +1,6 @@
 
 <file path=word/document.xml><?xml version="1.0" encoding="utf-8"?>
-<w:document xmlns:wpc="http://schemas.microsoft.com/office/word/2010/wordprocessingCanvas" xmlns:cx="http://schemas.microsoft.com/office/drawing/2014/chartex" xmlns:cx1="http://schemas.microsoft.com/office/drawing/2015/9/8/chartex" xmlns:cx2="http://schemas.microsoft.com/office/drawing/2015/10/21/chartex" xmlns:cx3="http://schemas.microsoft.com/office/drawing/2016/5/9/chartex" xmlns:cx4="http://schemas.microsoft.com/office/drawing/2016/5/10/chartex" xmlns:cx5="http://schemas.microsoft.com/office/drawing/2016/5/11/chartex" xmlns:cx6="http://schemas.microsoft.com/office/drawing/2016/5/12/chartex" xmlns:cx7="http://schemas.microsoft.com/office/drawing/2016/5/13/chartex" xmlns:cx8="http://schemas.microsoft.com/office/drawing/2016/5/14/chartex" xmlns:mc="http://schemas.openxmlformats.org/markup-compatibility/2006" xmlns:aink="http://schemas.microsoft.com/office/drawing/2016/ink" xmlns:am3d="http://schemas.microsoft.com/office/drawing/2017/model3d" xmlns:o="urn:schemas-microsoft-com:office:office" xmlns:oel="http://schemas.microsoft.com/office/2019/extlst" xmlns:r="http://schemas.openxmlformats.org/officeDocument/2006/relationships" xmlns:m="http://schemas.openxmlformats.org/officeDocument/2006/math" xmlns:v="urn:schemas-microsoft-com:vml" xmlns:wp14="http://schemas.microsoft.com/office/word/2010/wordprocessingDrawing" xmlns:wp="http://schemas.openxmlformats.org/drawingml/2006/wordprocessingDrawing" xmlns:w10="urn:schemas-microsoft-com:office:word" xmlns:w="http://schemas.openxmlformats.org/wordprocessingml/2006/main" xmlns:w14="http://schemas.microsoft.com/office/word/2010/wordml" xmlns:w15="http://schemas.microsoft.com/office/word/2012/wordml" xmlns:w16cex="http://schemas.microsoft.com/office/word/2018/wordml/cex" xmlns:w16cid="http://schemas.microsoft.com/office/word/2016/wordml/cid" xmlns:w16="http://schemas.microsoft.com/office/word/2018/wordml" xmlns:w16du="http://schemas.microsoft.com/office/word/2023/wordml/word16du" xmlns:w16sdtdh="http://schemas.microsoft.com/office/word/2020/wordml/sdtdatahash" xmlns:w16sdtfl="http://schemas.microsoft.com/office/word/2024/wordml/sdtformatlock" xmlns:w16se="http://schemas.microsoft.com/office/word/2015/wordml/symex" xmlns:wpg="http://schemas.microsoft.com/office/word/2010/wordprocessingGroup" xmlns:wpi="http://schemas.microsoft.com/office/word/2010/wordprocessingInk" xmlns:wne="http://schemas.microsoft.com/office/word/2006/wordml" xmlns:wps="http://schemas.microsoft.com/office/word/2010/wordprocessingShape" mc:Ignorable="w14 w15 w16se w16cid w16 w16cex w16sdtdh w16sdtfl w16du wp14">
+<w:document xmlns:wpc="http://schemas.microsoft.com/office/word/2010/wordprocessingCanvas" xmlns:cx="http://schemas.microsoft.com/office/drawing/2014/chartex" xmlns:cx1="http://schemas.microsoft.com/office/drawing/2015/9/8/chartex" xmlns:cx2="http://schemas.microsoft.com/office/drawing/2015/10/21/chartex" xmlns:cx3="http://schemas.microsoft.com/office/drawing/2016/5/9/chartex" xmlns:cx4="http://schemas.microsoft.com/office/drawing/2016/5/10/chartex" xmlns:cx5="http://schemas.microsoft.com/office/drawing/2016/5/11/chartex" xmlns:cx6="http://schemas.microsoft.com/office/drawing/2016/5/12/chartex" xmlns:cx7="http://schemas.microsoft.com/office/drawing/2016/5/13/chartex" xmlns:cx8="http://schemas.microsoft.com/office/drawing/2016/5/14/chartex" xmlns:mc="http://schemas.openxmlformats.org/markup-compatibility/2006" xmlns:aink="http://schemas.microsoft.com/office/drawing/2016/ink" xmlns:am3d="http://schemas.microsoft.com/office/drawing/2017/model3d" xmlns:o="urn:schemas-microsoft-com:office:office" xmlns:oel="http://schemas.microsoft.com/office/2019/extlst" xmlns:r="http://schemas.openxmlformats.org/officeDocument/2006/relationships" xmlns:m="http://schemas.openxmlformats.org/officeDocument/2006/math" xmlns:v="urn:schemas-microsoft-com:vml" xmlns:wp14="http://schemas.microsoft.com/office/word/2010/wordprocessingDrawing" xmlns:wp="http://schemas.openxmlformats.org/drawingml/2006/wordprocessingDrawing" xmlns:w10="urn:schemas-microsoft-com:office:word" xmlns:w="http://schemas.openxmlformats.org/wordprocessingml/2006/main" xmlns:w14="http://schemas.microsoft.com/office/word/2010/wordml" xmlns:w15="http://schemas.microsoft.com/office/word/2012/wordml" xmlns:w16cei="http://schemas.microsoft.com/office/word/2026/wordml/cei" xmlns:w16cex="http://schemas.microsoft.com/office/word/2018/wordml/cex" xmlns:w16cid="http://schemas.microsoft.com/office/word/2016/wordml/cid" xmlns:w16="http://schemas.microsoft.com/office/word/2018/wordml" xmlns:w16du="http://schemas.microsoft.com/office/word/2023/wordml/word16du" xmlns:w16sdtdh="http://schemas.microsoft.com/office/word/2020/wordml/sdtdatahash" xmlns:w16sdtfl="http://schemas.microsoft.com/office/word/2024/wordml/sdtformatlock" xmlns:w16se="http://schemas.microsoft.com/office/word/2015/wordml/symex" xmlns:wpg="http://schemas.microsoft.com/office/word/2010/wordprocessingGroup" xmlns:wpi="http://schemas.microsoft.com/office/word/2010/wordprocessingInk" xmlns:wne="http://schemas.microsoft.com/office/word/2006/wordml" xmlns:wps="http://schemas.microsoft.com/office/word/2010/wordprocessingShape" mc:Ignorable="w14 w15 w16se w16cid w16 w16cex w16sdtdh w16sdtfl w16du wp14">
   <w:body>
     <w:p>
       <w:pPr>
@@ -104,19 +104,11 @@
           <w:lang w:val="en-US"/>
         </w:rPr>
       </w:pPr>
-      <w:proofErr w:type="spellStart"/>
-      <w:r>
-        <w:rPr>
-          <w:lang w:val="en-US"/>
-        </w:rPr>
-        <w:t>Miniboss</w:t>
-      </w:r>
-      <w:proofErr w:type="spellEnd"/>
-      <w:r>
-        <w:rPr>
-          <w:lang w:val="en-US"/>
-        </w:rPr>
-        <w:t>:</w:t>
+      <w:r>
+        <w:rPr>
+          <w:lang w:val="en-US"/>
+        </w:rPr>
+        <w:t>Miniboss:</w:t>
       </w:r>
     </w:p>
     <w:p>
@@ -313,105 +305,35 @@
           <w:lang w:val="en-US"/>
         </w:rPr>
         <w:tab/>
-        <w:t xml:space="preserve">  on random time and if blood dagger circle </w:t>
-      </w:r>
-      <w:proofErr w:type="gramStart"/>
-      <w:r>
-        <w:rPr>
-          <w:lang w:val="en-US"/>
-        </w:rPr>
-        <w:t>exist</w:t>
-      </w:r>
-      <w:proofErr w:type="gramEnd"/>
-      <w:r>
-        <w:rPr>
-          <w:lang w:val="en-US"/>
-        </w:rPr>
-        <w:t xml:space="preserve">: </w:t>
-      </w:r>
-      <w:proofErr w:type="spellStart"/>
-      <w:r>
-        <w:rPr>
-          <w:lang w:val="en-US"/>
-        </w:rPr>
-        <w:t>goto</w:t>
-      </w:r>
-      <w:proofErr w:type="spellEnd"/>
-      <w:r>
-        <w:rPr>
-          <w:lang w:val="en-US"/>
-        </w:rPr>
-        <w:t xml:space="preserve"> 3</w:t>
-      </w:r>
-    </w:p>
-    <w:p>
-      <w:pPr>
-        <w:rPr>
-          <w:lang w:val="en-US"/>
-        </w:rPr>
-      </w:pPr>
-      <w:r>
-        <w:rPr>
-          <w:lang w:val="en-US"/>
-        </w:rPr>
-        <w:tab/>
-        <w:t xml:space="preserve">2 strafe closest player, </w:t>
-      </w:r>
-      <w:proofErr w:type="spellStart"/>
-      <w:r>
-        <w:rPr>
-          <w:lang w:val="en-US"/>
-        </w:rPr>
-        <w:t>goto</w:t>
-      </w:r>
-      <w:proofErr w:type="spellEnd"/>
-      <w:r>
-        <w:rPr>
-          <w:lang w:val="en-US"/>
-        </w:rPr>
-        <w:t xml:space="preserve"> 1 if too close,</w:t>
-      </w:r>
-    </w:p>
-    <w:p>
-      <w:pPr>
-        <w:rPr>
-          <w:lang w:val="en-US"/>
-        </w:rPr>
-      </w:pPr>
-      <w:r>
-        <w:rPr>
-          <w:lang w:val="en-US"/>
-        </w:rPr>
-        <w:tab/>
-        <w:t xml:space="preserve">  on random time and if blood dagger circle </w:t>
-      </w:r>
-      <w:proofErr w:type="gramStart"/>
-      <w:r>
-        <w:rPr>
-          <w:lang w:val="en-US"/>
-        </w:rPr>
-        <w:t>exist</w:t>
-      </w:r>
-      <w:proofErr w:type="gramEnd"/>
-      <w:r>
-        <w:rPr>
-          <w:lang w:val="en-US"/>
-        </w:rPr>
-        <w:t xml:space="preserve">: </w:t>
-      </w:r>
-      <w:proofErr w:type="spellStart"/>
-      <w:r>
-        <w:rPr>
-          <w:lang w:val="en-US"/>
-        </w:rPr>
-        <w:t>goto</w:t>
-      </w:r>
-      <w:proofErr w:type="spellEnd"/>
-      <w:r>
-        <w:rPr>
-          <w:lang w:val="en-US"/>
-        </w:rPr>
-        <w:t xml:space="preserve"> 3,</w:t>
+        <w:t xml:space="preserve">  on random time and if blood dagger circle exist: goto 3</w:t>
+      </w:r>
+    </w:p>
+    <w:p>
+      <w:pPr>
+        <w:rPr>
+          <w:lang w:val="en-US"/>
+        </w:rPr>
+      </w:pPr>
+      <w:r>
+        <w:rPr>
+          <w:lang w:val="en-US"/>
+        </w:rPr>
+        <w:tab/>
+        <w:t>2 strafe closest player, goto 1 if too close,</w:t>
+      </w:r>
+    </w:p>
+    <w:p>
+      <w:pPr>
+        <w:rPr>
+          <w:lang w:val="en-US"/>
+        </w:rPr>
+      </w:pPr>
+      <w:r>
+        <w:rPr>
+          <w:lang w:val="en-US"/>
+        </w:rPr>
+        <w:tab/>
+        <w:t xml:space="preserve">  on random time and if blood dagger circle exist: goto 3,</w:t>
       </w:r>
     </w:p>
     <w:p>
@@ -439,77 +361,21 @@
           <w:lang w:val="en-US"/>
         </w:rPr>
         <w:tab/>
-        <w:t xml:space="preserve">3 </w:t>
-      </w:r>
-      <w:proofErr w:type="spellStart"/>
-      <w:r>
-        <w:rPr>
-          <w:lang w:val="en-US"/>
-        </w:rPr>
-        <w:t>telegraf</w:t>
-      </w:r>
-      <w:proofErr w:type="spellEnd"/>
-      <w:r>
-        <w:rPr>
-          <w:lang w:val="en-US"/>
-        </w:rPr>
-        <w:t xml:space="preserve">, </w:t>
-      </w:r>
-      <w:proofErr w:type="spellStart"/>
-      <w:r>
-        <w:rPr>
-          <w:lang w:val="en-US"/>
-        </w:rPr>
-        <w:t>goto</w:t>
-      </w:r>
-      <w:proofErr w:type="spellEnd"/>
-      <w:r>
-        <w:rPr>
-          <w:lang w:val="en-US"/>
-        </w:rPr>
-        <w:t xml:space="preserve"> 4 or </w:t>
-      </w:r>
-      <w:proofErr w:type="spellStart"/>
-      <w:r>
-        <w:rPr>
-          <w:lang w:val="en-US"/>
-        </w:rPr>
-        <w:t>goto</w:t>
-      </w:r>
-      <w:proofErr w:type="spellEnd"/>
-      <w:r>
-        <w:rPr>
-          <w:lang w:val="en-US"/>
-        </w:rPr>
-        <w:t xml:space="preserve"> 1 if circling dagger chosen</w:t>
-      </w:r>
-    </w:p>
-    <w:p>
-      <w:pPr>
-        <w:rPr>
-          <w:lang w:val="en-US"/>
-        </w:rPr>
-      </w:pPr>
-      <w:r>
-        <w:rPr>
-          <w:lang w:val="en-US"/>
-        </w:rPr>
-        <w:tab/>
-        <w:t xml:space="preserve">4 attack, </w:t>
-      </w:r>
-      <w:proofErr w:type="spellStart"/>
-      <w:r>
-        <w:rPr>
-          <w:lang w:val="en-US"/>
-        </w:rPr>
-        <w:t>goto</w:t>
-      </w:r>
-      <w:proofErr w:type="spellEnd"/>
-      <w:r>
-        <w:rPr>
-          <w:lang w:val="en-US"/>
-        </w:rPr>
-        <w:t xml:space="preserve"> 1</w:t>
+        <w:t>3 telegraf, goto 4 or goto 1 if circling dagger chosen</w:t>
+      </w:r>
+    </w:p>
+    <w:p>
+      <w:pPr>
+        <w:rPr>
+          <w:lang w:val="en-US"/>
+        </w:rPr>
+      </w:pPr>
+      <w:r>
+        <w:rPr>
+          <w:lang w:val="en-US"/>
+        </w:rPr>
+        <w:tab/>
+        <w:t>4 attack, goto 1</w:t>
       </w:r>
     </w:p>
     <w:p>
@@ -620,49 +486,7 @@
         <w:rPr>
           <w:lang w:val="en-US"/>
         </w:rPr>
-        <w:t xml:space="preserve">: </w:t>
-      </w:r>
-      <w:proofErr w:type="spellStart"/>
-      <w:r>
-        <w:rPr>
-          <w:lang w:val="en-US"/>
-        </w:rPr>
-        <w:t>hasShield</w:t>
-      </w:r>
-      <w:proofErr w:type="spellEnd"/>
-      <w:r>
-        <w:rPr>
-          <w:lang w:val="en-US"/>
-        </w:rPr>
-        <w:t xml:space="preserve"> +5, </w:t>
-      </w:r>
-      <w:proofErr w:type="spellStart"/>
-      <w:r>
-        <w:rPr>
-          <w:lang w:val="en-US"/>
-        </w:rPr>
-        <w:t>isTooClose</w:t>
-      </w:r>
-      <w:proofErr w:type="spellEnd"/>
-      <w:r>
-        <w:rPr>
-          <w:lang w:val="en-US"/>
-        </w:rPr>
-        <w:t xml:space="preserve">: +5, </w:t>
-      </w:r>
-      <w:proofErr w:type="spellStart"/>
-      <w:r>
-        <w:rPr>
-          <w:lang w:val="en-US"/>
-        </w:rPr>
-        <w:t>isTooFar</w:t>
-      </w:r>
-      <w:proofErr w:type="spellEnd"/>
-      <w:r>
-        <w:rPr>
-          <w:lang w:val="en-US"/>
-        </w:rPr>
-        <w:t>: set to 0</w:t>
+        <w:t>: hasShield +5, isTooClose: +5, isTooFar: set to 0</w:t>
       </w:r>
     </w:p>
     <w:p>
@@ -690,63 +514,7 @@
         <w:rPr>
           <w:lang w:val="en-US"/>
         </w:rPr>
-        <w:t xml:space="preserve">: </w:t>
-      </w:r>
-      <w:proofErr w:type="spellStart"/>
-      <w:r>
-        <w:rPr>
-          <w:lang w:val="en-US"/>
-        </w:rPr>
-        <w:t>isTooClose</w:t>
-      </w:r>
-      <w:proofErr w:type="spellEnd"/>
-      <w:r>
-        <w:rPr>
-          <w:lang w:val="en-US"/>
-        </w:rPr>
-        <w:t xml:space="preserve">: +5, </w:t>
-      </w:r>
-      <w:proofErr w:type="spellStart"/>
-      <w:r>
-        <w:rPr>
-          <w:lang w:val="en-US"/>
-        </w:rPr>
-        <w:t>hasNoShield</w:t>
-      </w:r>
-      <w:proofErr w:type="spellEnd"/>
-      <w:r>
-        <w:rPr>
-          <w:lang w:val="en-US"/>
-        </w:rPr>
-        <w:t xml:space="preserve">: +5, </w:t>
-      </w:r>
-      <w:proofErr w:type="spellStart"/>
-      <w:r>
-        <w:rPr>
-          <w:lang w:val="en-US"/>
-        </w:rPr>
-        <w:t>isFarEnough</w:t>
-      </w:r>
-      <w:proofErr w:type="spellEnd"/>
-      <w:r>
-        <w:rPr>
-          <w:lang w:val="en-US"/>
-        </w:rPr>
-        <w:t xml:space="preserve">: -5, </w:t>
-      </w:r>
-      <w:proofErr w:type="spellStart"/>
-      <w:r>
-        <w:rPr>
-          <w:lang w:val="en-US"/>
-        </w:rPr>
-        <w:t>hasNoGoblin</w:t>
-      </w:r>
-      <w:proofErr w:type="spellEnd"/>
-      <w:r>
-        <w:rPr>
-          <w:lang w:val="en-US"/>
-        </w:rPr>
-        <w:t>: set to 0</w:t>
+        <w:t>: isTooClose: +5, hasNoShield: +5, isFarEnough: -5, hasNoGoblin: set to 0</w:t>
       </w:r>
     </w:p>
     <w:p>
@@ -788,49 +556,7 @@
         <w:rPr>
           <w:lang w:val="en-US"/>
         </w:rPr>
-        <w:t xml:space="preserve">: </w:t>
-      </w:r>
-      <w:proofErr w:type="spellStart"/>
-      <w:r>
-        <w:rPr>
-          <w:lang w:val="en-US"/>
-        </w:rPr>
-        <w:t>TooCloseAndHasShield</w:t>
-      </w:r>
-      <w:proofErr w:type="spellEnd"/>
-      <w:r>
-        <w:rPr>
-          <w:lang w:val="en-US"/>
-        </w:rPr>
-        <w:t xml:space="preserve">: +5, </w:t>
-      </w:r>
-      <w:proofErr w:type="spellStart"/>
-      <w:r>
-        <w:rPr>
-          <w:lang w:val="en-US"/>
-        </w:rPr>
-        <w:t>isFarEnough</w:t>
-      </w:r>
-      <w:proofErr w:type="spellEnd"/>
-      <w:r>
-        <w:rPr>
-          <w:lang w:val="en-US"/>
-        </w:rPr>
-        <w:t xml:space="preserve">: +10, </w:t>
-      </w:r>
-      <w:proofErr w:type="spellStart"/>
-      <w:r>
-        <w:rPr>
-          <w:lang w:val="en-US"/>
-        </w:rPr>
-        <w:t>hasNoGoblin</w:t>
-      </w:r>
-      <w:proofErr w:type="spellEnd"/>
-      <w:r>
-        <w:rPr>
-          <w:lang w:val="en-US"/>
-        </w:rPr>
-        <w:t>: +5</w:t>
+        <w:t>: TooCloseAndHasShield: +5, isFarEnough: +10, hasNoGoblin: +5</w:t>
       </w:r>
     </w:p>
     <w:p>
@@ -872,63 +598,7 @@
         <w:rPr>
           <w:lang w:val="en-US"/>
         </w:rPr>
-        <w:t xml:space="preserve">: </w:t>
-      </w:r>
-      <w:proofErr w:type="spellStart"/>
-      <w:r>
-        <w:rPr>
-          <w:lang w:val="en-US"/>
-        </w:rPr>
-        <w:t>TooClose</w:t>
-      </w:r>
-      <w:proofErr w:type="spellEnd"/>
-      <w:r>
-        <w:rPr>
-          <w:lang w:val="en-US"/>
-        </w:rPr>
-        <w:t xml:space="preserve">: -10, </w:t>
-      </w:r>
-      <w:proofErr w:type="spellStart"/>
-      <w:r>
-        <w:rPr>
-          <w:lang w:val="en-US"/>
-        </w:rPr>
-        <w:t>hasShield</w:t>
-      </w:r>
-      <w:proofErr w:type="spellEnd"/>
-      <w:r>
-        <w:rPr>
-          <w:lang w:val="en-US"/>
-        </w:rPr>
-        <w:t xml:space="preserve">: +5, </w:t>
-      </w:r>
-      <w:proofErr w:type="spellStart"/>
-      <w:r>
-        <w:rPr>
-          <w:lang w:val="en-US"/>
-        </w:rPr>
-        <w:t>isFarEnough</w:t>
-      </w:r>
-      <w:proofErr w:type="spellEnd"/>
-      <w:r>
-        <w:rPr>
-          <w:lang w:val="en-US"/>
-        </w:rPr>
-        <w:t xml:space="preserve">: +10, </w:t>
-      </w:r>
-      <w:proofErr w:type="spellStart"/>
-      <w:r>
-        <w:rPr>
-          <w:lang w:val="en-US"/>
-        </w:rPr>
-        <w:t>hasNoGoblin</w:t>
-      </w:r>
-      <w:proofErr w:type="spellEnd"/>
-      <w:r>
-        <w:rPr>
-          <w:lang w:val="en-US"/>
-        </w:rPr>
-        <w:t>: set to 0</w:t>
+        <w:t>: TooClose: -10, hasShield: +5, isFarEnough: +10, hasNoGoblin: set to 0</w:t>
       </w:r>
     </w:p>
     <w:p>
@@ -984,63 +654,7 @@
         <w:rPr>
           <w:lang w:val="en-US"/>
         </w:rPr>
-        <w:t xml:space="preserve">: </w:t>
-      </w:r>
-      <w:proofErr w:type="spellStart"/>
-      <w:r>
-        <w:rPr>
-          <w:lang w:val="en-US"/>
-        </w:rPr>
-        <w:t>TooClose</w:t>
-      </w:r>
-      <w:proofErr w:type="spellEnd"/>
-      <w:r>
-        <w:rPr>
-          <w:lang w:val="en-US"/>
-        </w:rPr>
-        <w:t xml:space="preserve">: -10, </w:t>
-      </w:r>
-      <w:proofErr w:type="spellStart"/>
-      <w:r>
-        <w:rPr>
-          <w:lang w:val="en-US"/>
-        </w:rPr>
-        <w:t>hasShield</w:t>
-      </w:r>
-      <w:proofErr w:type="spellEnd"/>
-      <w:r>
-        <w:rPr>
-          <w:lang w:val="en-US"/>
-        </w:rPr>
-        <w:t xml:space="preserve">: +5, </w:t>
-      </w:r>
-      <w:proofErr w:type="spellStart"/>
-      <w:r>
-        <w:rPr>
-          <w:lang w:val="en-US"/>
-        </w:rPr>
-        <w:t>isFarEnough</w:t>
-      </w:r>
-      <w:proofErr w:type="spellEnd"/>
-      <w:r>
-        <w:rPr>
-          <w:lang w:val="en-US"/>
-        </w:rPr>
-        <w:t xml:space="preserve">: +10, </w:t>
-      </w:r>
-      <w:proofErr w:type="spellStart"/>
-      <w:r>
-        <w:rPr>
-          <w:lang w:val="en-US"/>
-        </w:rPr>
-        <w:t>hasNoGoblin</w:t>
-      </w:r>
-      <w:proofErr w:type="spellEnd"/>
-      <w:r>
-        <w:rPr>
-          <w:lang w:val="en-US"/>
-        </w:rPr>
-        <w:t>: set to 0</w:t>
+        <w:t>: TooClose: -10, hasShield: +5, isFarEnough: +10, hasNoGoblin: set to 0</w:t>
       </w:r>
     </w:p>
     <w:p>
@@ -1078,69 +692,11 @@
         </w:rPr>
         <w:t xml:space="preserve">: </w:t>
       </w:r>
-      <w:proofErr w:type="spellStart"/>
-      <w:r>
-        <w:rPr>
-          <w:lang w:val="en-US"/>
-        </w:rPr>
-        <w:t>TooClose</w:t>
-      </w:r>
-      <w:proofErr w:type="spellEnd"/>
-      <w:r>
-        <w:rPr>
-          <w:lang w:val="en-US"/>
-        </w:rPr>
-        <w:t xml:space="preserve">: -5, </w:t>
-      </w:r>
-      <w:proofErr w:type="spellStart"/>
-      <w:r>
-        <w:rPr>
-          <w:lang w:val="en-US"/>
-        </w:rPr>
-        <w:t>isFarEnough</w:t>
-      </w:r>
-      <w:proofErr w:type="spellEnd"/>
-      <w:r>
-        <w:rPr>
-          <w:lang w:val="en-US"/>
-        </w:rPr>
-        <w:t xml:space="preserve">: +10, </w:t>
-      </w:r>
-      <w:proofErr w:type="spellStart"/>
-      <w:r>
-        <w:rPr>
-          <w:lang w:val="en-US"/>
-        </w:rPr>
-        <w:t>HasNoShield</w:t>
-      </w:r>
-      <w:proofErr w:type="spellEnd"/>
-      <w:r>
-        <w:rPr>
-          <w:lang w:val="en-US"/>
-        </w:rPr>
-        <w:t>: +</w:t>
-      </w:r>
-      <w:proofErr w:type="gramStart"/>
-      <w:r>
-        <w:rPr>
-          <w:lang w:val="en-US"/>
-        </w:rPr>
-        <w:t xml:space="preserve">10,  </w:t>
-      </w:r>
-      <w:proofErr w:type="spellStart"/>
-      <w:r>
-        <w:rPr>
-          <w:lang w:val="en-US"/>
-        </w:rPr>
-        <w:t>hasShield</w:t>
-      </w:r>
-      <w:proofErr w:type="spellEnd"/>
-      <w:proofErr w:type="gramEnd"/>
-      <w:r>
-        <w:rPr>
-          <w:lang w:val="en-US"/>
-        </w:rPr>
-        <w:t>: set to 0</w:t>
+      <w:r>
+        <w:rPr>
+          <w:lang w:val="en-US"/>
+        </w:rPr>
+        <w:t>TooClose: -5, isFarEnough: +10, HasNoShield: +10,  hasShield: set to 0</w:t>
       </w:r>
     </w:p>
     <w:p>
@@ -1188,71 +744,35 @@
           <w:lang w:val="en-US"/>
         </w:rPr>
         <w:tab/>
-        <w:t xml:space="preserve">2 </w:t>
-      </w:r>
-      <w:proofErr w:type="gramStart"/>
-      <w:r>
-        <w:rPr>
-          <w:lang w:val="en-US"/>
-        </w:rPr>
-        <w:t>walk</w:t>
-      </w:r>
-      <w:proofErr w:type="gramEnd"/>
-      <w:r>
-        <w:rPr>
-          <w:lang w:val="en-US"/>
-        </w:rPr>
-        <w:t xml:space="preserve"> in circle around player</w:t>
-      </w:r>
-    </w:p>
-    <w:p>
-      <w:pPr>
-        <w:rPr>
-          <w:lang w:val="en-US"/>
-        </w:rPr>
-      </w:pPr>
-      <w:r>
-        <w:rPr>
-          <w:lang w:val="en-US"/>
-        </w:rPr>
-        <w:tab/>
-        <w:t xml:space="preserve">3 </w:t>
-      </w:r>
-      <w:proofErr w:type="spellStart"/>
-      <w:r>
-        <w:rPr>
-          <w:lang w:val="en-US"/>
-        </w:rPr>
-        <w:t>telegraf</w:t>
-      </w:r>
-      <w:proofErr w:type="spellEnd"/>
-    </w:p>
-    <w:p>
-      <w:pPr>
-        <w:rPr>
-          <w:lang w:val="en-US"/>
-        </w:rPr>
-      </w:pPr>
-      <w:r>
-        <w:rPr>
-          <w:lang w:val="en-US"/>
-        </w:rPr>
-        <w:tab/>
-        <w:t xml:space="preserve">4 </w:t>
-      </w:r>
-      <w:proofErr w:type="gramStart"/>
-      <w:r>
-        <w:rPr>
-          <w:lang w:val="en-US"/>
-        </w:rPr>
-        <w:t>hit</w:t>
-      </w:r>
-      <w:proofErr w:type="gramEnd"/>
-      <w:r>
-        <w:rPr>
-          <w:lang w:val="en-US"/>
-        </w:rPr>
-        <w:t xml:space="preserve"> in random time intervals (more realistic when swarms of goblins are there)</w:t>
+        <w:t>2 walk in circle around player</w:t>
+      </w:r>
+    </w:p>
+    <w:p>
+      <w:pPr>
+        <w:rPr>
+          <w:lang w:val="en-US"/>
+        </w:rPr>
+      </w:pPr>
+      <w:r>
+        <w:rPr>
+          <w:lang w:val="en-US"/>
+        </w:rPr>
+        <w:tab/>
+        <w:t>3 telegraf</w:t>
+      </w:r>
+    </w:p>
+    <w:p>
+      <w:pPr>
+        <w:rPr>
+          <w:lang w:val="en-US"/>
+        </w:rPr>
+      </w:pPr>
+      <w:r>
+        <w:rPr>
+          <w:lang w:val="en-US"/>
+        </w:rPr>
+        <w:tab/>
+        <w:t>4 hit in random time intervals (more realistic when swarms of goblins are there)</w:t>
       </w:r>
     </w:p>
     <w:p>
@@ -1300,21 +820,7 @@
           <w:lang w:val="en-US"/>
         </w:rPr>
         <w:tab/>
-        <w:t xml:space="preserve">6 </w:t>
-      </w:r>
-      <w:proofErr w:type="spellStart"/>
-      <w:r>
-        <w:rPr>
-          <w:lang w:val="en-US"/>
-        </w:rPr>
-        <w:t>goto</w:t>
-      </w:r>
-      <w:proofErr w:type="spellEnd"/>
-      <w:r>
-        <w:rPr>
-          <w:lang w:val="en-US"/>
-        </w:rPr>
-        <w:t xml:space="preserve"> 1</w:t>
+        <w:t>6 goto 1</w:t>
       </w:r>
     </w:p>
     <w:p>
@@ -1404,21 +910,7 @@
           <w:lang w:val="en-US"/>
         </w:rPr>
         <w:tab/>
-        <w:t xml:space="preserve">3 </w:t>
-      </w:r>
-      <w:proofErr w:type="gramStart"/>
-      <w:r>
-        <w:rPr>
-          <w:lang w:val="en-US"/>
-        </w:rPr>
-        <w:t>shoot</w:t>
-      </w:r>
-      <w:proofErr w:type="gramEnd"/>
-      <w:r>
-        <w:rPr>
-          <w:lang w:val="en-US"/>
-        </w:rPr>
-        <w:t xml:space="preserve"> when in range</w:t>
+        <w:t>3 shoot when in range</w:t>
       </w:r>
     </w:p>
     <w:p>
@@ -1446,21 +938,7 @@
           <w:lang w:val="en-US"/>
         </w:rPr>
         <w:tab/>
-        <w:t xml:space="preserve">5 </w:t>
-      </w:r>
-      <w:proofErr w:type="spellStart"/>
-      <w:r>
-        <w:rPr>
-          <w:lang w:val="en-US"/>
-        </w:rPr>
-        <w:t>goto</w:t>
-      </w:r>
-      <w:proofErr w:type="spellEnd"/>
-      <w:r>
-        <w:rPr>
-          <w:lang w:val="en-US"/>
-        </w:rPr>
-        <w:t xml:space="preserve"> 1</w:t>
+        <w:t>5 goto 1</w:t>
       </w:r>
     </w:p>
     <w:p>
@@ -1522,71 +1000,35 @@
           <w:lang w:val="en-US"/>
         </w:rPr>
         <w:tab/>
-        <w:t xml:space="preserve">2 </w:t>
-      </w:r>
-      <w:proofErr w:type="spellStart"/>
-      <w:r>
-        <w:rPr>
-          <w:lang w:val="en-US"/>
-        </w:rPr>
-        <w:t>telegraf</w:t>
-      </w:r>
-      <w:proofErr w:type="spellEnd"/>
-      <w:r>
-        <w:rPr>
-          <w:lang w:val="en-US"/>
-        </w:rPr>
-        <w:t xml:space="preserve"> bite</w:t>
-      </w:r>
-    </w:p>
-    <w:p>
-      <w:pPr>
-        <w:rPr>
-          <w:lang w:val="en-US"/>
-        </w:rPr>
-      </w:pPr>
-      <w:r>
-        <w:rPr>
-          <w:lang w:val="en-US"/>
-        </w:rPr>
-        <w:tab/>
-        <w:t xml:space="preserve">3 </w:t>
-      </w:r>
-      <w:proofErr w:type="gramStart"/>
-      <w:r>
-        <w:rPr>
-          <w:lang w:val="en-US"/>
-        </w:rPr>
-        <w:t>bite</w:t>
-      </w:r>
-      <w:proofErr w:type="gramEnd"/>
-    </w:p>
-    <w:p>
-      <w:pPr>
-        <w:rPr>
-          <w:lang w:val="en-US"/>
-        </w:rPr>
-      </w:pPr>
-      <w:r>
-        <w:rPr>
-          <w:lang w:val="en-US"/>
-        </w:rPr>
-        <w:tab/>
-        <w:t xml:space="preserve">4 </w:t>
-      </w:r>
-      <w:proofErr w:type="spellStart"/>
-      <w:r>
-        <w:rPr>
-          <w:lang w:val="en-US"/>
-        </w:rPr>
-        <w:t>goto</w:t>
-      </w:r>
-      <w:proofErr w:type="spellEnd"/>
-      <w:r>
-        <w:rPr>
-          <w:lang w:val="en-US"/>
-        </w:rPr>
-        <w:t xml:space="preserve"> 1</w:t>
+        <w:t>2 telegraf bite</w:t>
+      </w:r>
+    </w:p>
+    <w:p>
+      <w:pPr>
+        <w:rPr>
+          <w:lang w:val="en-US"/>
+        </w:rPr>
+      </w:pPr>
+      <w:r>
+        <w:rPr>
+          <w:lang w:val="en-US"/>
+        </w:rPr>
+        <w:tab/>
+        <w:t>3 bite</w:t>
+      </w:r>
+    </w:p>
+    <w:p>
+      <w:pPr>
+        <w:rPr>
+          <w:lang w:val="en-US"/>
+        </w:rPr>
+      </w:pPr>
+      <w:r>
+        <w:rPr>
+          <w:lang w:val="en-US"/>
+        </w:rPr>
+        <w:tab/>
+        <w:t>4 goto 1</w:t>
       </w:r>
     </w:p>
     <w:p>
@@ -1831,21 +1273,7 @@
           <w:lang w:val="en-US"/>
         </w:rPr>
         <w:tab/>
-        <w:t xml:space="preserve">- one light, (slash </w:t>
-      </w:r>
-      <w:proofErr w:type="spellStart"/>
-      <w:r>
-        <w:rPr>
-          <w:lang w:val="en-US"/>
-        </w:rPr>
-        <w:t>slash</w:t>
-      </w:r>
-      <w:proofErr w:type="spellEnd"/>
-      <w:r>
-        <w:rPr>
-          <w:lang w:val="en-US"/>
-        </w:rPr>
-        <w:t xml:space="preserve"> stab)</w:t>
+        <w:t>- one light, (slash slash stab)</w:t>
       </w:r>
     </w:p>
     <w:p>
@@ -1899,111 +1327,27 @@
           <w:lang w:val="en-US"/>
         </w:rPr>
         <w:tab/>
-        <w:t xml:space="preserve">- light, (pew </w:t>
-      </w:r>
-      <w:proofErr w:type="spellStart"/>
-      <w:r>
-        <w:rPr>
-          <w:lang w:val="en-US"/>
-        </w:rPr>
-        <w:t>pew</w:t>
-      </w:r>
-      <w:proofErr w:type="spellEnd"/>
-      <w:r>
-        <w:rPr>
-          <w:lang w:val="en-US"/>
-        </w:rPr>
-        <w:t xml:space="preserve"> </w:t>
-      </w:r>
-      <w:proofErr w:type="spellStart"/>
-      <w:r>
-        <w:rPr>
-          <w:lang w:val="en-US"/>
-        </w:rPr>
-        <w:t>pew</w:t>
-      </w:r>
-      <w:proofErr w:type="spellEnd"/>
-      <w:r>
-        <w:rPr>
-          <w:lang w:val="en-US"/>
-        </w:rPr>
-        <w:t xml:space="preserve">, mini cool down, pew </w:t>
-      </w:r>
-      <w:proofErr w:type="spellStart"/>
-      <w:r>
-        <w:rPr>
-          <w:lang w:val="en-US"/>
-        </w:rPr>
-        <w:t>pew</w:t>
-      </w:r>
-      <w:proofErr w:type="spellEnd"/>
-      <w:r>
-        <w:rPr>
-          <w:lang w:val="en-US"/>
-        </w:rPr>
-        <w:t xml:space="preserve"> </w:t>
-      </w:r>
-      <w:proofErr w:type="spellStart"/>
-      <w:r>
-        <w:rPr>
-          <w:lang w:val="en-US"/>
-        </w:rPr>
-        <w:t>pew</w:t>
-      </w:r>
-      <w:proofErr w:type="spellEnd"/>
-      <w:r>
-        <w:rPr>
-          <w:lang w:val="en-US"/>
-        </w:rPr>
-        <w:t xml:space="preserve"> ...)</w:t>
-      </w:r>
-    </w:p>
-    <w:p>
-      <w:pPr>
-        <w:rPr>
-          <w:lang w:val="en-US"/>
-        </w:rPr>
-      </w:pPr>
-      <w:r>
-        <w:rPr>
-          <w:lang w:val="en-US"/>
-        </w:rPr>
-        <w:tab/>
-      </w:r>
-      <w:r>
-        <w:rPr>
-          <w:lang w:val="en-US"/>
-        </w:rPr>
-        <w:tab/>
-        <w:t xml:space="preserve">- heavy, charges as long as pew </w:t>
-      </w:r>
-      <w:proofErr w:type="spellStart"/>
-      <w:r>
-        <w:rPr>
-          <w:lang w:val="en-US"/>
-        </w:rPr>
-        <w:t>pew</w:t>
-      </w:r>
-      <w:proofErr w:type="spellEnd"/>
-      <w:r>
-        <w:rPr>
-          <w:lang w:val="en-US"/>
-        </w:rPr>
-        <w:t xml:space="preserve"> </w:t>
-      </w:r>
-      <w:proofErr w:type="spellStart"/>
-      <w:r>
-        <w:rPr>
-          <w:lang w:val="en-US"/>
-        </w:rPr>
-        <w:t>pew</w:t>
-      </w:r>
-      <w:proofErr w:type="spellEnd"/>
-      <w:r>
-        <w:rPr>
-          <w:lang w:val="en-US"/>
-        </w:rPr>
-        <w:t xml:space="preserve"> + mini cooldown, but then shoots 5 at once then minibreak</w:t>
+        <w:t>- light, (pew pew pew, mini cool down, pew pew pew ...)</w:t>
+      </w:r>
+    </w:p>
+    <w:p>
+      <w:pPr>
+        <w:rPr>
+          <w:lang w:val="en-US"/>
+        </w:rPr>
+      </w:pPr>
+      <w:r>
+        <w:rPr>
+          <w:lang w:val="en-US"/>
+        </w:rPr>
+        <w:tab/>
+      </w:r>
+      <w:r>
+        <w:rPr>
+          <w:lang w:val="en-US"/>
+        </w:rPr>
+        <w:tab/>
+        <w:t>- heavy, charges as long as pew pew pew + mini cooldown, but then shoots 5 at once then minibreak</w:t>
       </w:r>
     </w:p>
     <w:p>
@@ -2201,21 +1545,7 @@
           <w:lang w:val="en-US"/>
         </w:rPr>
         <w:tab/>
-        <w:t xml:space="preserve">  outbreaks of monsters, but ultimately leading to a good ending, where </w:t>
-      </w:r>
-      <w:proofErr w:type="spellStart"/>
-      <w:r>
-        <w:rPr>
-          <w:lang w:val="en-US"/>
-        </w:rPr>
-        <w:t>hes</w:t>
-      </w:r>
-      <w:proofErr w:type="spellEnd"/>
-      <w:r>
-        <w:rPr>
-          <w:lang w:val="en-US"/>
-        </w:rPr>
-        <w:t xml:space="preserve"> not revived</w:t>
+        <w:t xml:space="preserve">  outbreaks of monsters, but ultimately leading to a good ending, where hes not revived</w:t>
       </w:r>
     </w:p>
     <w:p>
@@ -2283,21 +1613,7 @@
         <w:rPr>
           <w:lang w:val="en-US"/>
         </w:rPr>
-        <w:t xml:space="preserve">- first jungle item: whip, later to be upgraded to </w:t>
-      </w:r>
-      <w:proofErr w:type="spellStart"/>
-      <w:r>
-        <w:rPr>
-          <w:lang w:val="en-US"/>
-        </w:rPr>
-        <w:t>grapling</w:t>
-      </w:r>
-      <w:proofErr w:type="spellEnd"/>
-      <w:r>
-        <w:rPr>
-          <w:lang w:val="en-US"/>
-        </w:rPr>
-        <w:t xml:space="preserve"> hook. can pull things and stun enemies, </w:t>
+        <w:t xml:space="preserve">- first jungle item: whip, later to be upgraded to grapling hook. can pull things and stun enemies, </w:t>
       </w:r>
     </w:p>
     <w:p>
@@ -2385,19 +1701,11 @@
           <w:lang w:val="en-US"/>
         </w:rPr>
       </w:pPr>
-      <w:proofErr w:type="spellStart"/>
-      <w:r>
-        <w:rPr>
-          <w:lang w:val="en-US"/>
-        </w:rPr>
-        <w:t>beyblade</w:t>
-      </w:r>
-      <w:proofErr w:type="spellEnd"/>
-      <w:r>
-        <w:rPr>
-          <w:lang w:val="en-US"/>
-        </w:rPr>
-        <w:t>,</w:t>
+      <w:r>
+        <w:rPr>
+          <w:lang w:val="en-US"/>
+        </w:rPr>
+        <w:t>beyblade,</w:t>
       </w:r>
     </w:p>
     <w:p>
@@ -2419,60 +1727,24 @@
           <w:lang w:val="en-US"/>
         </w:rPr>
       </w:pPr>
-      <w:proofErr w:type="spellStart"/>
-      <w:r>
-        <w:rPr>
-          <w:lang w:val="en-US"/>
-        </w:rPr>
-        <w:t>grapling</w:t>
-      </w:r>
-      <w:proofErr w:type="spellEnd"/>
-      <w:r>
-        <w:rPr>
-          <w:lang w:val="en-US"/>
-        </w:rPr>
-        <w:t xml:space="preserve"> hook,</w:t>
-      </w:r>
-    </w:p>
-    <w:p>
-      <w:pPr>
-        <w:rPr>
-          <w:lang w:val="en-US"/>
-        </w:rPr>
-      </w:pPr>
-      <w:r>
-        <w:rPr>
-          <w:lang w:val="en-US"/>
-        </w:rPr>
-        <w:t xml:space="preserve">1 spell, (fire, </w:t>
-      </w:r>
-      <w:proofErr w:type="spellStart"/>
-      <w:r>
-        <w:rPr>
-          <w:lang w:val="en-US"/>
-        </w:rPr>
-        <w:t>tp</w:t>
-      </w:r>
-      <w:proofErr w:type="spellEnd"/>
-      <w:r>
-        <w:rPr>
-          <w:lang w:val="en-US"/>
-        </w:rPr>
-        <w:t>, ice</w:t>
-      </w:r>
-      <w:proofErr w:type="gramStart"/>
-      <w:r>
-        <w:rPr>
-          <w:lang w:val="en-US"/>
-        </w:rPr>
-        <w:t xml:space="preserve"> ..?</w:t>
-      </w:r>
-      <w:proofErr w:type="gramEnd"/>
-      <w:r>
-        <w:rPr>
-          <w:lang w:val="en-US"/>
-        </w:rPr>
-        <w:t>)</w:t>
+      <w:r>
+        <w:rPr>
+          <w:lang w:val="en-US"/>
+        </w:rPr>
+        <w:t>grapling hook,</w:t>
+      </w:r>
+    </w:p>
+    <w:p>
+      <w:pPr>
+        <w:rPr>
+          <w:lang w:val="en-US"/>
+        </w:rPr>
+      </w:pPr>
+      <w:r>
+        <w:rPr>
+          <w:lang w:val="en-US"/>
+        </w:rPr>
+        <w:t>1 spell, (fire, tp, ice ..?)</w:t>
       </w:r>
     </w:p>
     <w:p>
@@ -2537,21 +1809,7 @@
         <w:rPr>
           <w:lang w:val="en-US"/>
         </w:rPr>
-        <w:t xml:space="preserve">wind boots </w:t>
-      </w:r>
-      <w:proofErr w:type="gramStart"/>
-      <w:r>
-        <w:rPr>
-          <w:lang w:val="en-US"/>
-        </w:rPr>
-        <w:t>( dash</w:t>
-      </w:r>
-      <w:proofErr w:type="gramEnd"/>
-      <w:r>
-        <w:rPr>
-          <w:lang w:val="en-US"/>
-        </w:rPr>
-        <w:t xml:space="preserve">) </w:t>
+        <w:t xml:space="preserve">wind boots ( dash) </w:t>
       </w:r>
     </w:p>
     <w:p>
@@ -2569,6 +1827,9 @@
     </w:p>
     <w:p>
       <w:pPr>
+        <w:tabs>
+          <w:tab w:val="left" w:pos="5358"/>
+        </w:tabs>
         <w:rPr>
           <w:lang w:val="en-US"/>
         </w:rPr>
@@ -2578,6 +1839,53 @@
           <w:lang w:val="en-US"/>
         </w:rPr>
         <w:t>spirit lantern (scare, burn plants, illusion visible)</w:t>
+      </w:r>
+      <w:r>
+        <w:rPr>
+          <w:lang w:val="en-US"/>
+        </w:rPr>
+        <w:tab/>
+      </w:r>
+    </w:p>
+    <w:p>
+      <w:pPr>
+        <w:tabs>
+          <w:tab w:val="left" w:pos="5358"/>
+        </w:tabs>
+        <w:rPr>
+          <w:lang w:val="en-US"/>
+        </w:rPr>
+      </w:pPr>
+    </w:p>
+    <w:p>
+      <w:pPr>
+        <w:tabs>
+          <w:tab w:val="left" w:pos="5358"/>
+        </w:tabs>
+        <w:rPr>
+          <w:lang w:val="en-US"/>
+        </w:rPr>
+      </w:pPr>
+    </w:p>
+    <w:p>
+      <w:pPr>
+        <w:pStyle w:val="ListParagraph"/>
+        <w:numPr>
+          <w:ilvl w:val="0"/>
+          <w:numId w:val="1"/>
+        </w:numPr>
+        <w:tabs>
+          <w:tab w:val="left" w:pos="5358"/>
+        </w:tabs>
+        <w:rPr>
+          <w:lang w:val="en-US"/>
+        </w:rPr>
+      </w:pPr>
+      <w:r>
+        <w:rPr>
+          <w:lang w:val="en-US"/>
+        </w:rPr>
+        <w:t>Make interesting environments so that every attacks can have impact(knockback effect) which can interact with the environments</w:t>
       </w:r>
     </w:p>
     <w:sectPr>
@@ -2588,6 +1896,126 @@
     </w:sectPr>
   </w:body>
 </w:document>
+</file>
+
+<file path=word/numbering.xml><?xml version="1.0" encoding="utf-8"?>
+<w:numbering xmlns:wpc="http://schemas.microsoft.com/office/word/2010/wordprocessingCanvas" xmlns:cx="http://schemas.microsoft.com/office/drawing/2014/chartex" xmlns:cx1="http://schemas.microsoft.com/office/drawing/2015/9/8/chartex" xmlns:cx2="http://schemas.microsoft.com/office/drawing/2015/10/21/chartex" xmlns:cx3="http://schemas.microsoft.com/office/drawing/2016/5/9/chartex" xmlns:cx4="http://schemas.microsoft.com/office/drawing/2016/5/10/chartex" xmlns:cx5="http://schemas.microsoft.com/office/drawing/2016/5/11/chartex" xmlns:cx6="http://schemas.microsoft.com/office/drawing/2016/5/12/chartex" xmlns:cx7="http://schemas.microsoft.com/office/drawing/2016/5/13/chartex" xmlns:cx8="http://schemas.microsoft.com/office/drawing/2016/5/14/chartex" xmlns:mc="http://schemas.openxmlformats.org/markup-compatibility/2006" xmlns:aink="http://schemas.microsoft.com/office/drawing/2016/ink" xmlns:am3d="http://schemas.microsoft.com/office/drawing/2017/model3d" xmlns:o="urn:schemas-microsoft-com:office:office" xmlns:oel="http://schemas.microsoft.com/office/2019/extlst" xmlns:r="http://schemas.openxmlformats.org/officeDocument/2006/relationships" xmlns:m="http://schemas.openxmlformats.org/officeDocument/2006/math" xmlns:v="urn:schemas-microsoft-com:vml" xmlns:wp14="http://schemas.microsoft.com/office/word/2010/wordprocessingDrawing" xmlns:wp="http://schemas.openxmlformats.org/drawingml/2006/wordprocessingDrawing" xmlns:w10="urn:schemas-microsoft-com:office:word" xmlns:w="http://schemas.openxmlformats.org/wordprocessingml/2006/main" xmlns:w14="http://schemas.microsoft.com/office/word/2010/wordml" xmlns:w15="http://schemas.microsoft.com/office/word/2012/wordml" xmlns:w16cei="http://schemas.microsoft.com/office/word/2026/wordml/cei" xmlns:w16cex="http://schemas.microsoft.com/office/word/2018/wordml/cex" xmlns:w16cid="http://schemas.microsoft.com/office/word/2016/wordml/cid" xmlns:w16="http://schemas.microsoft.com/office/word/2018/wordml" xmlns:w16du="http://schemas.microsoft.com/office/word/2023/wordml/word16du" xmlns:w16sdtdh="http://schemas.microsoft.com/office/word/2020/wordml/sdtdatahash" xmlns:w16sdtfl="http://schemas.microsoft.com/office/word/2024/wordml/sdtformatlock" xmlns:w16se="http://schemas.microsoft.com/office/word/2015/wordml/symex" xmlns:wpg="http://schemas.microsoft.com/office/word/2010/wordprocessingGroup" xmlns:wpi="http://schemas.microsoft.com/office/word/2010/wordprocessingInk" xmlns:wne="http://schemas.microsoft.com/office/word/2006/wordml" xmlns:wps="http://schemas.microsoft.com/office/word/2010/wordprocessingShape" mc:Ignorable="w14 w15 w16se w16cid w16 w16cex w16sdtdh w16sdtfl w16du wp14">
+  <w:abstractNum w:abstractNumId="0" w15:restartNumberingAfterBreak="0">
+    <w:nsid w:val="165F5DF2"/>
+    <w:multiLevelType w:val="hybridMultilevel"/>
+    <w:tmpl w:val="222C35D6"/>
+    <w:lvl w:ilvl="0" w:tplc="4FC470E2">
+      <w:numFmt w:val="bullet"/>
+      <w:lvlText w:val="-"/>
+      <w:lvlJc w:val="left"/>
+      <w:pPr>
+        <w:ind w:left="720" w:hanging="360"/>
+      </w:pPr>
+      <w:rPr>
+        <w:rFonts w:ascii="Calibri" w:eastAsiaTheme="minorEastAsia" w:hAnsi="Calibri" w:cs="Calibri" w:hint="default"/>
+      </w:rPr>
+    </w:lvl>
+    <w:lvl w:ilvl="1" w:tplc="08090003" w:tentative="1">
+      <w:start w:val="1"/>
+      <w:numFmt w:val="bullet"/>
+      <w:lvlText w:val="o"/>
+      <w:lvlJc w:val="left"/>
+      <w:pPr>
+        <w:ind w:left="1440" w:hanging="360"/>
+      </w:pPr>
+      <w:rPr>
+        <w:rFonts w:ascii="Courier New" w:hAnsi="Courier New" w:cs="Courier New" w:hint="default"/>
+      </w:rPr>
+    </w:lvl>
+    <w:lvl w:ilvl="2" w:tplc="08090005" w:tentative="1">
+      <w:start w:val="1"/>
+      <w:numFmt w:val="bullet"/>
+      <w:lvlText w:val=""/>
+      <w:lvlJc w:val="left"/>
+      <w:pPr>
+        <w:ind w:left="2160" w:hanging="360"/>
+      </w:pPr>
+      <w:rPr>
+        <w:rFonts w:ascii="Wingdings" w:hAnsi="Wingdings" w:hint="default"/>
+      </w:rPr>
+    </w:lvl>
+    <w:lvl w:ilvl="3" w:tplc="08090001" w:tentative="1">
+      <w:start w:val="1"/>
+      <w:numFmt w:val="bullet"/>
+      <w:lvlText w:val=""/>
+      <w:lvlJc w:val="left"/>
+      <w:pPr>
+        <w:ind w:left="2880" w:hanging="360"/>
+      </w:pPr>
+      <w:rPr>
+        <w:rFonts w:ascii="Symbol" w:hAnsi="Symbol" w:hint="default"/>
+      </w:rPr>
+    </w:lvl>
+    <w:lvl w:ilvl="4" w:tplc="08090003" w:tentative="1">
+      <w:start w:val="1"/>
+      <w:numFmt w:val="bullet"/>
+      <w:lvlText w:val="o"/>
+      <w:lvlJc w:val="left"/>
+      <w:pPr>
+        <w:ind w:left="3600" w:hanging="360"/>
+      </w:pPr>
+      <w:rPr>
+        <w:rFonts w:ascii="Courier New" w:hAnsi="Courier New" w:cs="Courier New" w:hint="default"/>
+      </w:rPr>
+    </w:lvl>
+    <w:lvl w:ilvl="5" w:tplc="08090005" w:tentative="1">
+      <w:start w:val="1"/>
+      <w:numFmt w:val="bullet"/>
+      <w:lvlText w:val=""/>
+      <w:lvlJc w:val="left"/>
+      <w:pPr>
+        <w:ind w:left="4320" w:hanging="360"/>
+      </w:pPr>
+      <w:rPr>
+        <w:rFonts w:ascii="Wingdings" w:hAnsi="Wingdings" w:hint="default"/>
+      </w:rPr>
+    </w:lvl>
+    <w:lvl w:ilvl="6" w:tplc="08090001" w:tentative="1">
+      <w:start w:val="1"/>
+      <w:numFmt w:val="bullet"/>
+      <w:lvlText w:val=""/>
+      <w:lvlJc w:val="left"/>
+      <w:pPr>
+        <w:ind w:left="5040" w:hanging="360"/>
+      </w:pPr>
+      <w:rPr>
+        <w:rFonts w:ascii="Symbol" w:hAnsi="Symbol" w:hint="default"/>
+      </w:rPr>
+    </w:lvl>
+    <w:lvl w:ilvl="7" w:tplc="08090003" w:tentative="1">
+      <w:start w:val="1"/>
+      <w:numFmt w:val="bullet"/>
+      <w:lvlText w:val="o"/>
+      <w:lvlJc w:val="left"/>
+      <w:pPr>
+        <w:ind w:left="5760" w:hanging="360"/>
+      </w:pPr>
+      <w:rPr>
+        <w:rFonts w:ascii="Courier New" w:hAnsi="Courier New" w:cs="Courier New" w:hint="default"/>
+      </w:rPr>
+    </w:lvl>
+    <w:lvl w:ilvl="8" w:tplc="08090005" w:tentative="1">
+      <w:start w:val="1"/>
+      <w:numFmt w:val="bullet"/>
+      <w:lvlText w:val=""/>
+      <w:lvlJc w:val="left"/>
+      <w:pPr>
+        <w:ind w:left="6480" w:hanging="360"/>
+      </w:pPr>
+      <w:rPr>
+        <w:rFonts w:ascii="Wingdings" w:hAnsi="Wingdings" w:hint="default"/>
+      </w:rPr>
+    </w:lvl>
+  </w:abstractNum>
+  <w:num w:numId="1" w16cid:durableId="666664639">
+    <w:abstractNumId w:val="0"/>
+  </w:num>
+</w:numbering>
 </file>
 
 <file path=word/styles.xml><?xml version="1.0" encoding="utf-8"?>

</xml_diff>

<commit_message>
initial brainstorming for shield/dodge problem + some mini tweaks
</commit_message>
<xml_diff>
--- a/Misc/design.docx
+++ b/Misc/design.docx
@@ -1,6 +1,6 @@
 
 <file path=word/document.xml><?xml version="1.0" encoding="utf-8"?>
-<w:document xmlns:wpc="http://schemas.microsoft.com/office/word/2010/wordprocessingCanvas" xmlns:cx="http://schemas.microsoft.com/office/drawing/2014/chartex" xmlns:cx1="http://schemas.microsoft.com/office/drawing/2015/9/8/chartex" xmlns:cx2="http://schemas.microsoft.com/office/drawing/2015/10/21/chartex" xmlns:cx3="http://schemas.microsoft.com/office/drawing/2016/5/9/chartex" xmlns:cx4="http://schemas.microsoft.com/office/drawing/2016/5/10/chartex" xmlns:cx5="http://schemas.microsoft.com/office/drawing/2016/5/11/chartex" xmlns:cx6="http://schemas.microsoft.com/office/drawing/2016/5/12/chartex" xmlns:cx7="http://schemas.microsoft.com/office/drawing/2016/5/13/chartex" xmlns:cx8="http://schemas.microsoft.com/office/drawing/2016/5/14/chartex" xmlns:mc="http://schemas.openxmlformats.org/markup-compatibility/2006" xmlns:aink="http://schemas.microsoft.com/office/drawing/2016/ink" xmlns:am3d="http://schemas.microsoft.com/office/drawing/2017/model3d" xmlns:o="urn:schemas-microsoft-com:office:office" xmlns:oel="http://schemas.microsoft.com/office/2019/extlst" xmlns:r="http://schemas.openxmlformats.org/officeDocument/2006/relationships" xmlns:m="http://schemas.openxmlformats.org/officeDocument/2006/math" xmlns:v="urn:schemas-microsoft-com:vml" xmlns:wp14="http://schemas.microsoft.com/office/word/2010/wordprocessingDrawing" xmlns:wp="http://schemas.openxmlformats.org/drawingml/2006/wordprocessingDrawing" xmlns:w10="urn:schemas-microsoft-com:office:word" xmlns:w="http://schemas.openxmlformats.org/wordprocessingml/2006/main" xmlns:w14="http://schemas.microsoft.com/office/word/2010/wordml" xmlns:w15="http://schemas.microsoft.com/office/word/2012/wordml" xmlns:w16cex="http://schemas.microsoft.com/office/word/2018/wordml/cex" xmlns:w16cid="http://schemas.microsoft.com/office/word/2016/wordml/cid" xmlns:w16="http://schemas.microsoft.com/office/word/2018/wordml" xmlns:w16du="http://schemas.microsoft.com/office/word/2023/wordml/word16du" xmlns:w16sdtdh="http://schemas.microsoft.com/office/word/2020/wordml/sdtdatahash" xmlns:w16sdtfl="http://schemas.microsoft.com/office/word/2024/wordml/sdtformatlock" xmlns:w16se="http://schemas.microsoft.com/office/word/2015/wordml/symex" xmlns:wpg="http://schemas.microsoft.com/office/word/2010/wordprocessingGroup" xmlns:wpi="http://schemas.microsoft.com/office/word/2010/wordprocessingInk" xmlns:wne="http://schemas.microsoft.com/office/word/2006/wordml" xmlns:wps="http://schemas.microsoft.com/office/word/2010/wordprocessingShape" mc:Ignorable="w14 w15 w16se w16cid w16 w16cex w16sdtdh w16sdtfl w16du wp14">
+<w:document xmlns:wpc="http://schemas.microsoft.com/office/word/2010/wordprocessingCanvas" xmlns:cx="http://schemas.microsoft.com/office/drawing/2014/chartex" xmlns:cx1="http://schemas.microsoft.com/office/drawing/2015/9/8/chartex" xmlns:cx2="http://schemas.microsoft.com/office/drawing/2015/10/21/chartex" xmlns:cx3="http://schemas.microsoft.com/office/drawing/2016/5/9/chartex" xmlns:cx4="http://schemas.microsoft.com/office/drawing/2016/5/10/chartex" xmlns:cx5="http://schemas.microsoft.com/office/drawing/2016/5/11/chartex" xmlns:cx6="http://schemas.microsoft.com/office/drawing/2016/5/12/chartex" xmlns:cx7="http://schemas.microsoft.com/office/drawing/2016/5/13/chartex" xmlns:cx8="http://schemas.microsoft.com/office/drawing/2016/5/14/chartex" xmlns:mc="http://schemas.openxmlformats.org/markup-compatibility/2006" xmlns:aink="http://schemas.microsoft.com/office/drawing/2016/ink" xmlns:am3d="http://schemas.microsoft.com/office/drawing/2017/model3d" xmlns:o="urn:schemas-microsoft-com:office:office" xmlns:oel="http://schemas.microsoft.com/office/2019/extlst" xmlns:r="http://schemas.openxmlformats.org/officeDocument/2006/relationships" xmlns:m="http://schemas.openxmlformats.org/officeDocument/2006/math" xmlns:v="urn:schemas-microsoft-com:vml" xmlns:wp14="http://schemas.microsoft.com/office/word/2010/wordprocessingDrawing" xmlns:wp="http://schemas.openxmlformats.org/drawingml/2006/wordprocessingDrawing" xmlns:w10="urn:schemas-microsoft-com:office:word" xmlns:w="http://schemas.openxmlformats.org/wordprocessingml/2006/main" xmlns:w14="http://schemas.microsoft.com/office/word/2010/wordml" xmlns:w15="http://schemas.microsoft.com/office/word/2012/wordml" xmlns:w16cei="http://schemas.microsoft.com/office/word/2026/wordml/cei" xmlns:w16cex="http://schemas.microsoft.com/office/word/2018/wordml/cex" xmlns:w16cid="http://schemas.microsoft.com/office/word/2016/wordml/cid" xmlns:w16="http://schemas.microsoft.com/office/word/2018/wordml" xmlns:w16du="http://schemas.microsoft.com/office/word/2023/wordml/word16du" xmlns:w16sdtdh="http://schemas.microsoft.com/office/word/2020/wordml/sdtdatahash" xmlns:w16sdtfl="http://schemas.microsoft.com/office/word/2024/wordml/sdtformatlock" xmlns:w16se="http://schemas.microsoft.com/office/word/2015/wordml/symex" xmlns:wpg="http://schemas.microsoft.com/office/word/2010/wordprocessingGroup" xmlns:wpi="http://schemas.microsoft.com/office/word/2010/wordprocessingInk" xmlns:wne="http://schemas.microsoft.com/office/word/2006/wordml" xmlns:wps="http://schemas.microsoft.com/office/word/2010/wordprocessingShape" mc:Ignorable="w14 w15 w16se w16cid w16 w16cex w16sdtdh w16sdtfl w16du wp14">
   <w:body>
     <w:p>
       <w:pPr>
@@ -88,6 +88,91 @@
         <w:rPr>
           <w:lang w:val="en-US"/>
         </w:rPr>
+        <w:t>Knockback state (or without state?) for player and support in the take damage function for it</w:t>
+      </w:r>
+    </w:p>
+    <w:p>
+      <w:pPr>
+        <w:rPr>
+          <w:lang w:val="en-US"/>
+        </w:rPr>
+      </w:pPr>
+      <w:r>
+        <w:rPr>
+          <w:lang w:val="en-US"/>
+        </w:rPr>
+        <w:t xml:space="preserve">Blocking ideas: </w:t>
+      </w:r>
+    </w:p>
+    <w:p>
+      <w:pPr>
+        <w:rPr>
+          <w:lang w:val="en-US"/>
+        </w:rPr>
+      </w:pPr>
+      <w:r>
+        <w:rPr>
+          <w:lang w:val="en-US"/>
+        </w:rPr>
+        <w:t>Idea 1: directional shield with hp. Physical shield gets no damage from phys, but magic, Magical shield that gets no damage from magic but phys, players need to position accordingly against strong enemies, but weak is fine</w:t>
+      </w:r>
+      <w:r>
+        <w:rPr>
+          <w:lang w:val="en-US"/>
+        </w:rPr>
+        <w:t>, breaking shield results in getting stunned, shields regens over time when not using.</w:t>
+      </w:r>
+    </w:p>
+    <w:p>
+      <w:pPr>
+        <w:rPr>
+          <w:lang w:val="en-US"/>
+        </w:rPr>
+      </w:pPr>
+      <w:r>
+        <w:rPr>
+          <w:lang w:val="en-US"/>
+        </w:rPr>
+        <w:t>Idea 2: directional shield (with or without hp?), melee char can jump to mage and shield her in a direction, mage char can cast directional shield (that stays static in that direction?) from a distance</w:t>
+      </w:r>
+    </w:p>
+    <w:p>
+      <w:pPr>
+        <w:rPr>
+          <w:lang w:val="en-US"/>
+        </w:rPr>
+      </w:pPr>
+    </w:p>
+    <w:p>
+      <w:pPr>
+        <w:rPr>
+          <w:lang w:val="en-US"/>
+        </w:rPr>
+      </w:pPr>
+      <w:r>
+        <w:rPr>
+          <w:lang w:val="en-US"/>
+        </w:rPr>
+        <w:t>(random idea, linked magic casting, casting magic from melee warrior)</w:t>
+      </w:r>
+    </w:p>
+    <w:p>
+      <w:pPr>
+        <w:rPr>
+          <w:lang w:val="en-US"/>
+        </w:rPr>
+      </w:pPr>
+    </w:p>
+    <w:p>
+      <w:pPr>
+        <w:rPr>
+          <w:lang w:val="en-US"/>
+        </w:rPr>
+      </w:pPr>
+      <w:r>
+        <w:rPr>
+          <w:lang w:val="en-US"/>
+        </w:rPr>
         <w:t>Enemies:</w:t>
       </w:r>
     </w:p>
@@ -104,19 +189,11 @@
           <w:lang w:val="en-US"/>
         </w:rPr>
       </w:pPr>
-      <w:proofErr w:type="spellStart"/>
-      <w:r>
-        <w:rPr>
-          <w:lang w:val="en-US"/>
-        </w:rPr>
-        <w:t>Miniboss</w:t>
-      </w:r>
-      <w:proofErr w:type="spellEnd"/>
-      <w:r>
-        <w:rPr>
-          <w:lang w:val="en-US"/>
-        </w:rPr>
-        <w:t>:</w:t>
+      <w:r>
+        <w:rPr>
+          <w:lang w:val="en-US"/>
+        </w:rPr>
+        <w:t>Miniboss:</w:t>
       </w:r>
     </w:p>
     <w:p>
@@ -313,105 +390,35 @@
           <w:lang w:val="en-US"/>
         </w:rPr>
         <w:tab/>
-        <w:t xml:space="preserve">  on random time and if blood dagger circle </w:t>
-      </w:r>
-      <w:proofErr w:type="gramStart"/>
-      <w:r>
-        <w:rPr>
-          <w:lang w:val="en-US"/>
-        </w:rPr>
-        <w:t>exist</w:t>
-      </w:r>
-      <w:proofErr w:type="gramEnd"/>
-      <w:r>
-        <w:rPr>
-          <w:lang w:val="en-US"/>
-        </w:rPr>
-        <w:t xml:space="preserve">: </w:t>
-      </w:r>
-      <w:proofErr w:type="spellStart"/>
-      <w:r>
-        <w:rPr>
-          <w:lang w:val="en-US"/>
-        </w:rPr>
-        <w:t>goto</w:t>
-      </w:r>
-      <w:proofErr w:type="spellEnd"/>
-      <w:r>
-        <w:rPr>
-          <w:lang w:val="en-US"/>
-        </w:rPr>
-        <w:t xml:space="preserve"> 3</w:t>
-      </w:r>
-    </w:p>
-    <w:p>
-      <w:pPr>
-        <w:rPr>
-          <w:lang w:val="en-US"/>
-        </w:rPr>
-      </w:pPr>
-      <w:r>
-        <w:rPr>
-          <w:lang w:val="en-US"/>
-        </w:rPr>
-        <w:tab/>
-        <w:t xml:space="preserve">2 strafe closest player, </w:t>
-      </w:r>
-      <w:proofErr w:type="spellStart"/>
-      <w:r>
-        <w:rPr>
-          <w:lang w:val="en-US"/>
-        </w:rPr>
-        <w:t>goto</w:t>
-      </w:r>
-      <w:proofErr w:type="spellEnd"/>
-      <w:r>
-        <w:rPr>
-          <w:lang w:val="en-US"/>
-        </w:rPr>
-        <w:t xml:space="preserve"> 1 if too close,</w:t>
-      </w:r>
-    </w:p>
-    <w:p>
-      <w:pPr>
-        <w:rPr>
-          <w:lang w:val="en-US"/>
-        </w:rPr>
-      </w:pPr>
-      <w:r>
-        <w:rPr>
-          <w:lang w:val="en-US"/>
-        </w:rPr>
-        <w:tab/>
-        <w:t xml:space="preserve">  on random time and if blood dagger circle </w:t>
-      </w:r>
-      <w:proofErr w:type="gramStart"/>
-      <w:r>
-        <w:rPr>
-          <w:lang w:val="en-US"/>
-        </w:rPr>
-        <w:t>exist</w:t>
-      </w:r>
-      <w:proofErr w:type="gramEnd"/>
-      <w:r>
-        <w:rPr>
-          <w:lang w:val="en-US"/>
-        </w:rPr>
-        <w:t xml:space="preserve">: </w:t>
-      </w:r>
-      <w:proofErr w:type="spellStart"/>
-      <w:r>
-        <w:rPr>
-          <w:lang w:val="en-US"/>
-        </w:rPr>
-        <w:t>goto</w:t>
-      </w:r>
-      <w:proofErr w:type="spellEnd"/>
-      <w:r>
-        <w:rPr>
-          <w:lang w:val="en-US"/>
-        </w:rPr>
-        <w:t xml:space="preserve"> 3,</w:t>
+        <w:t xml:space="preserve">  on random time and if blood dagger circle exist: goto 3</w:t>
+      </w:r>
+    </w:p>
+    <w:p>
+      <w:pPr>
+        <w:rPr>
+          <w:lang w:val="en-US"/>
+        </w:rPr>
+      </w:pPr>
+      <w:r>
+        <w:rPr>
+          <w:lang w:val="en-US"/>
+        </w:rPr>
+        <w:tab/>
+        <w:t>2 strafe closest player, goto 1 if too close,</w:t>
+      </w:r>
+    </w:p>
+    <w:p>
+      <w:pPr>
+        <w:rPr>
+          <w:lang w:val="en-US"/>
+        </w:rPr>
+      </w:pPr>
+      <w:r>
+        <w:rPr>
+          <w:lang w:val="en-US"/>
+        </w:rPr>
+        <w:tab/>
+        <w:t xml:space="preserve">  on random time and if blood dagger circle exist: goto 3,</w:t>
       </w:r>
     </w:p>
     <w:p>
@@ -439,77 +446,21 @@
           <w:lang w:val="en-US"/>
         </w:rPr>
         <w:tab/>
-        <w:t xml:space="preserve">3 </w:t>
-      </w:r>
-      <w:proofErr w:type="spellStart"/>
-      <w:r>
-        <w:rPr>
-          <w:lang w:val="en-US"/>
-        </w:rPr>
-        <w:t>telegraf</w:t>
-      </w:r>
-      <w:proofErr w:type="spellEnd"/>
-      <w:r>
-        <w:rPr>
-          <w:lang w:val="en-US"/>
-        </w:rPr>
-        <w:t xml:space="preserve">, </w:t>
-      </w:r>
-      <w:proofErr w:type="spellStart"/>
-      <w:r>
-        <w:rPr>
-          <w:lang w:val="en-US"/>
-        </w:rPr>
-        <w:t>goto</w:t>
-      </w:r>
-      <w:proofErr w:type="spellEnd"/>
-      <w:r>
-        <w:rPr>
-          <w:lang w:val="en-US"/>
-        </w:rPr>
-        <w:t xml:space="preserve"> 4 or </w:t>
-      </w:r>
-      <w:proofErr w:type="spellStart"/>
-      <w:r>
-        <w:rPr>
-          <w:lang w:val="en-US"/>
-        </w:rPr>
-        <w:t>goto</w:t>
-      </w:r>
-      <w:proofErr w:type="spellEnd"/>
-      <w:r>
-        <w:rPr>
-          <w:lang w:val="en-US"/>
-        </w:rPr>
-        <w:t xml:space="preserve"> 1 if circling dagger chosen</w:t>
-      </w:r>
-    </w:p>
-    <w:p>
-      <w:pPr>
-        <w:rPr>
-          <w:lang w:val="en-US"/>
-        </w:rPr>
-      </w:pPr>
-      <w:r>
-        <w:rPr>
-          <w:lang w:val="en-US"/>
-        </w:rPr>
-        <w:tab/>
-        <w:t xml:space="preserve">4 attack, </w:t>
-      </w:r>
-      <w:proofErr w:type="spellStart"/>
-      <w:r>
-        <w:rPr>
-          <w:lang w:val="en-US"/>
-        </w:rPr>
-        <w:t>goto</w:t>
-      </w:r>
-      <w:proofErr w:type="spellEnd"/>
-      <w:r>
-        <w:rPr>
-          <w:lang w:val="en-US"/>
-        </w:rPr>
-        <w:t xml:space="preserve"> 1</w:t>
+        <w:t>3 telegraf, goto 4 or goto 1 if circling dagger chosen</w:t>
+      </w:r>
+    </w:p>
+    <w:p>
+      <w:pPr>
+        <w:rPr>
+          <w:lang w:val="en-US"/>
+        </w:rPr>
+      </w:pPr>
+      <w:r>
+        <w:rPr>
+          <w:lang w:val="en-US"/>
+        </w:rPr>
+        <w:tab/>
+        <w:t>4 attack, goto 1</w:t>
       </w:r>
     </w:p>
     <w:p>
@@ -620,49 +571,7 @@
         <w:rPr>
           <w:lang w:val="en-US"/>
         </w:rPr>
-        <w:t xml:space="preserve">: </w:t>
-      </w:r>
-      <w:proofErr w:type="spellStart"/>
-      <w:r>
-        <w:rPr>
-          <w:lang w:val="en-US"/>
-        </w:rPr>
-        <w:t>hasShield</w:t>
-      </w:r>
-      <w:proofErr w:type="spellEnd"/>
-      <w:r>
-        <w:rPr>
-          <w:lang w:val="en-US"/>
-        </w:rPr>
-        <w:t xml:space="preserve"> +5, </w:t>
-      </w:r>
-      <w:proofErr w:type="spellStart"/>
-      <w:r>
-        <w:rPr>
-          <w:lang w:val="en-US"/>
-        </w:rPr>
-        <w:t>isTooClose</w:t>
-      </w:r>
-      <w:proofErr w:type="spellEnd"/>
-      <w:r>
-        <w:rPr>
-          <w:lang w:val="en-US"/>
-        </w:rPr>
-        <w:t xml:space="preserve">: +5, </w:t>
-      </w:r>
-      <w:proofErr w:type="spellStart"/>
-      <w:r>
-        <w:rPr>
-          <w:lang w:val="en-US"/>
-        </w:rPr>
-        <w:t>isTooFar</w:t>
-      </w:r>
-      <w:proofErr w:type="spellEnd"/>
-      <w:r>
-        <w:rPr>
-          <w:lang w:val="en-US"/>
-        </w:rPr>
-        <w:t>: set to 0</w:t>
+        <w:t>: hasShield +5, isTooClose: +5, isTooFar: set to 0</w:t>
       </w:r>
     </w:p>
     <w:p>
@@ -690,63 +599,7 @@
         <w:rPr>
           <w:lang w:val="en-US"/>
         </w:rPr>
-        <w:t xml:space="preserve">: </w:t>
-      </w:r>
-      <w:proofErr w:type="spellStart"/>
-      <w:r>
-        <w:rPr>
-          <w:lang w:val="en-US"/>
-        </w:rPr>
-        <w:t>isTooClose</w:t>
-      </w:r>
-      <w:proofErr w:type="spellEnd"/>
-      <w:r>
-        <w:rPr>
-          <w:lang w:val="en-US"/>
-        </w:rPr>
-        <w:t xml:space="preserve">: +5, </w:t>
-      </w:r>
-      <w:proofErr w:type="spellStart"/>
-      <w:r>
-        <w:rPr>
-          <w:lang w:val="en-US"/>
-        </w:rPr>
-        <w:t>hasNoShield</w:t>
-      </w:r>
-      <w:proofErr w:type="spellEnd"/>
-      <w:r>
-        <w:rPr>
-          <w:lang w:val="en-US"/>
-        </w:rPr>
-        <w:t xml:space="preserve">: +5, </w:t>
-      </w:r>
-      <w:proofErr w:type="spellStart"/>
-      <w:r>
-        <w:rPr>
-          <w:lang w:val="en-US"/>
-        </w:rPr>
-        <w:t>isFarEnough</w:t>
-      </w:r>
-      <w:proofErr w:type="spellEnd"/>
-      <w:r>
-        <w:rPr>
-          <w:lang w:val="en-US"/>
-        </w:rPr>
-        <w:t xml:space="preserve">: -5, </w:t>
-      </w:r>
-      <w:proofErr w:type="spellStart"/>
-      <w:r>
-        <w:rPr>
-          <w:lang w:val="en-US"/>
-        </w:rPr>
-        <w:t>hasNoGoblin</w:t>
-      </w:r>
-      <w:proofErr w:type="spellEnd"/>
-      <w:r>
-        <w:rPr>
-          <w:lang w:val="en-US"/>
-        </w:rPr>
-        <w:t>: set to 0</w:t>
+        <w:t>: isTooClose: +5, hasNoShield: +5, isFarEnough: -5, hasNoGoblin: set to 0</w:t>
       </w:r>
     </w:p>
     <w:p>
@@ -788,49 +641,7 @@
         <w:rPr>
           <w:lang w:val="en-US"/>
         </w:rPr>
-        <w:t xml:space="preserve">: </w:t>
-      </w:r>
-      <w:proofErr w:type="spellStart"/>
-      <w:r>
-        <w:rPr>
-          <w:lang w:val="en-US"/>
-        </w:rPr>
-        <w:t>TooCloseAndHasShield</w:t>
-      </w:r>
-      <w:proofErr w:type="spellEnd"/>
-      <w:r>
-        <w:rPr>
-          <w:lang w:val="en-US"/>
-        </w:rPr>
-        <w:t xml:space="preserve">: +5, </w:t>
-      </w:r>
-      <w:proofErr w:type="spellStart"/>
-      <w:r>
-        <w:rPr>
-          <w:lang w:val="en-US"/>
-        </w:rPr>
-        <w:t>isFarEnough</w:t>
-      </w:r>
-      <w:proofErr w:type="spellEnd"/>
-      <w:r>
-        <w:rPr>
-          <w:lang w:val="en-US"/>
-        </w:rPr>
-        <w:t xml:space="preserve">: +10, </w:t>
-      </w:r>
-      <w:proofErr w:type="spellStart"/>
-      <w:r>
-        <w:rPr>
-          <w:lang w:val="en-US"/>
-        </w:rPr>
-        <w:t>hasNoGoblin</w:t>
-      </w:r>
-      <w:proofErr w:type="spellEnd"/>
-      <w:r>
-        <w:rPr>
-          <w:lang w:val="en-US"/>
-        </w:rPr>
-        <w:t>: +5</w:t>
+        <w:t>: TooCloseAndHasShield: +5, isFarEnough: +10, hasNoGoblin: +5</w:t>
       </w:r>
     </w:p>
     <w:p>
@@ -872,63 +683,7 @@
         <w:rPr>
           <w:lang w:val="en-US"/>
         </w:rPr>
-        <w:t xml:space="preserve">: </w:t>
-      </w:r>
-      <w:proofErr w:type="spellStart"/>
-      <w:r>
-        <w:rPr>
-          <w:lang w:val="en-US"/>
-        </w:rPr>
-        <w:t>TooClose</w:t>
-      </w:r>
-      <w:proofErr w:type="spellEnd"/>
-      <w:r>
-        <w:rPr>
-          <w:lang w:val="en-US"/>
-        </w:rPr>
-        <w:t xml:space="preserve">: -10, </w:t>
-      </w:r>
-      <w:proofErr w:type="spellStart"/>
-      <w:r>
-        <w:rPr>
-          <w:lang w:val="en-US"/>
-        </w:rPr>
-        <w:t>hasShield</w:t>
-      </w:r>
-      <w:proofErr w:type="spellEnd"/>
-      <w:r>
-        <w:rPr>
-          <w:lang w:val="en-US"/>
-        </w:rPr>
-        <w:t xml:space="preserve">: +5, </w:t>
-      </w:r>
-      <w:proofErr w:type="spellStart"/>
-      <w:r>
-        <w:rPr>
-          <w:lang w:val="en-US"/>
-        </w:rPr>
-        <w:t>isFarEnough</w:t>
-      </w:r>
-      <w:proofErr w:type="spellEnd"/>
-      <w:r>
-        <w:rPr>
-          <w:lang w:val="en-US"/>
-        </w:rPr>
-        <w:t xml:space="preserve">: +10, </w:t>
-      </w:r>
-      <w:proofErr w:type="spellStart"/>
-      <w:r>
-        <w:rPr>
-          <w:lang w:val="en-US"/>
-        </w:rPr>
-        <w:t>hasNoGoblin</w:t>
-      </w:r>
-      <w:proofErr w:type="spellEnd"/>
-      <w:r>
-        <w:rPr>
-          <w:lang w:val="en-US"/>
-        </w:rPr>
-        <w:t>: set to 0</w:t>
+        <w:t>: TooClose: -10, hasShield: +5, isFarEnough: +10, hasNoGoblin: set to 0</w:t>
       </w:r>
     </w:p>
     <w:p>
@@ -984,63 +739,7 @@
         <w:rPr>
           <w:lang w:val="en-US"/>
         </w:rPr>
-        <w:t xml:space="preserve">: </w:t>
-      </w:r>
-      <w:proofErr w:type="spellStart"/>
-      <w:r>
-        <w:rPr>
-          <w:lang w:val="en-US"/>
-        </w:rPr>
-        <w:t>TooClose</w:t>
-      </w:r>
-      <w:proofErr w:type="spellEnd"/>
-      <w:r>
-        <w:rPr>
-          <w:lang w:val="en-US"/>
-        </w:rPr>
-        <w:t xml:space="preserve">: -10, </w:t>
-      </w:r>
-      <w:proofErr w:type="spellStart"/>
-      <w:r>
-        <w:rPr>
-          <w:lang w:val="en-US"/>
-        </w:rPr>
-        <w:t>hasShield</w:t>
-      </w:r>
-      <w:proofErr w:type="spellEnd"/>
-      <w:r>
-        <w:rPr>
-          <w:lang w:val="en-US"/>
-        </w:rPr>
-        <w:t xml:space="preserve">: +5, </w:t>
-      </w:r>
-      <w:proofErr w:type="spellStart"/>
-      <w:r>
-        <w:rPr>
-          <w:lang w:val="en-US"/>
-        </w:rPr>
-        <w:t>isFarEnough</w:t>
-      </w:r>
-      <w:proofErr w:type="spellEnd"/>
-      <w:r>
-        <w:rPr>
-          <w:lang w:val="en-US"/>
-        </w:rPr>
-        <w:t xml:space="preserve">: +10, </w:t>
-      </w:r>
-      <w:proofErr w:type="spellStart"/>
-      <w:r>
-        <w:rPr>
-          <w:lang w:val="en-US"/>
-        </w:rPr>
-        <w:t>hasNoGoblin</w:t>
-      </w:r>
-      <w:proofErr w:type="spellEnd"/>
-      <w:r>
-        <w:rPr>
-          <w:lang w:val="en-US"/>
-        </w:rPr>
-        <w:t>: set to 0</w:t>
+        <w:t>: TooClose: -10, hasShield: +5, isFarEnough: +10, hasNoGoblin: set to 0</w:t>
       </w:r>
     </w:p>
     <w:p>
@@ -1078,69 +777,11 @@
         </w:rPr>
         <w:t xml:space="preserve">: </w:t>
       </w:r>
-      <w:proofErr w:type="spellStart"/>
-      <w:r>
-        <w:rPr>
-          <w:lang w:val="en-US"/>
-        </w:rPr>
-        <w:t>TooClose</w:t>
-      </w:r>
-      <w:proofErr w:type="spellEnd"/>
-      <w:r>
-        <w:rPr>
-          <w:lang w:val="en-US"/>
-        </w:rPr>
-        <w:t xml:space="preserve">: -5, </w:t>
-      </w:r>
-      <w:proofErr w:type="spellStart"/>
-      <w:r>
-        <w:rPr>
-          <w:lang w:val="en-US"/>
-        </w:rPr>
-        <w:t>isFarEnough</w:t>
-      </w:r>
-      <w:proofErr w:type="spellEnd"/>
-      <w:r>
-        <w:rPr>
-          <w:lang w:val="en-US"/>
-        </w:rPr>
-        <w:t xml:space="preserve">: +10, </w:t>
-      </w:r>
-      <w:proofErr w:type="spellStart"/>
-      <w:r>
-        <w:rPr>
-          <w:lang w:val="en-US"/>
-        </w:rPr>
-        <w:t>HasNoShield</w:t>
-      </w:r>
-      <w:proofErr w:type="spellEnd"/>
-      <w:r>
-        <w:rPr>
-          <w:lang w:val="en-US"/>
-        </w:rPr>
-        <w:t>: +</w:t>
-      </w:r>
-      <w:proofErr w:type="gramStart"/>
-      <w:r>
-        <w:rPr>
-          <w:lang w:val="en-US"/>
-        </w:rPr>
-        <w:t xml:space="preserve">10,  </w:t>
-      </w:r>
-      <w:proofErr w:type="spellStart"/>
-      <w:r>
-        <w:rPr>
-          <w:lang w:val="en-US"/>
-        </w:rPr>
-        <w:t>hasShield</w:t>
-      </w:r>
-      <w:proofErr w:type="spellEnd"/>
-      <w:proofErr w:type="gramEnd"/>
-      <w:r>
-        <w:rPr>
-          <w:lang w:val="en-US"/>
-        </w:rPr>
-        <w:t>: set to 0</w:t>
+      <w:r>
+        <w:rPr>
+          <w:lang w:val="en-US"/>
+        </w:rPr>
+        <w:t>TooClose: -5, isFarEnough: +10, HasNoShield: +10,  hasShield: set to 0</w:t>
       </w:r>
     </w:p>
     <w:p>
@@ -1173,6 +814,7 @@
         <w:rPr>
           <w:lang w:val="en-US"/>
         </w:rPr>
+        <w:lastRenderedPageBreak/>
         <w:tab/>
         <w:t>1 walk up to nearest player</w:t>
       </w:r>
@@ -1188,71 +830,35 @@
           <w:lang w:val="en-US"/>
         </w:rPr>
         <w:tab/>
-        <w:t xml:space="preserve">2 </w:t>
-      </w:r>
-      <w:proofErr w:type="gramStart"/>
-      <w:r>
-        <w:rPr>
-          <w:lang w:val="en-US"/>
-        </w:rPr>
-        <w:t>walk</w:t>
-      </w:r>
-      <w:proofErr w:type="gramEnd"/>
-      <w:r>
-        <w:rPr>
-          <w:lang w:val="en-US"/>
-        </w:rPr>
-        <w:t xml:space="preserve"> in circle around player</w:t>
-      </w:r>
-    </w:p>
-    <w:p>
-      <w:pPr>
-        <w:rPr>
-          <w:lang w:val="en-US"/>
-        </w:rPr>
-      </w:pPr>
-      <w:r>
-        <w:rPr>
-          <w:lang w:val="en-US"/>
-        </w:rPr>
-        <w:tab/>
-        <w:t xml:space="preserve">3 </w:t>
-      </w:r>
-      <w:proofErr w:type="spellStart"/>
-      <w:r>
-        <w:rPr>
-          <w:lang w:val="en-US"/>
-        </w:rPr>
-        <w:t>telegraf</w:t>
-      </w:r>
-      <w:proofErr w:type="spellEnd"/>
-    </w:p>
-    <w:p>
-      <w:pPr>
-        <w:rPr>
-          <w:lang w:val="en-US"/>
-        </w:rPr>
-      </w:pPr>
-      <w:r>
-        <w:rPr>
-          <w:lang w:val="en-US"/>
-        </w:rPr>
-        <w:tab/>
-        <w:t xml:space="preserve">4 </w:t>
-      </w:r>
-      <w:proofErr w:type="gramStart"/>
-      <w:r>
-        <w:rPr>
-          <w:lang w:val="en-US"/>
-        </w:rPr>
-        <w:t>hit</w:t>
-      </w:r>
-      <w:proofErr w:type="gramEnd"/>
-      <w:r>
-        <w:rPr>
-          <w:lang w:val="en-US"/>
-        </w:rPr>
-        <w:t xml:space="preserve"> in random time intervals (more realistic when swarms of goblins are there)</w:t>
+        <w:t>2 walk in circle around player</w:t>
+      </w:r>
+    </w:p>
+    <w:p>
+      <w:pPr>
+        <w:rPr>
+          <w:lang w:val="en-US"/>
+        </w:rPr>
+      </w:pPr>
+      <w:r>
+        <w:rPr>
+          <w:lang w:val="en-US"/>
+        </w:rPr>
+        <w:tab/>
+        <w:t>3 telegraf</w:t>
+      </w:r>
+    </w:p>
+    <w:p>
+      <w:pPr>
+        <w:rPr>
+          <w:lang w:val="en-US"/>
+        </w:rPr>
+      </w:pPr>
+      <w:r>
+        <w:rPr>
+          <w:lang w:val="en-US"/>
+        </w:rPr>
+        <w:tab/>
+        <w:t>4 hit in random time intervals (more realistic when swarms of goblins are there)</w:t>
       </w:r>
     </w:p>
     <w:p>
@@ -1300,21 +906,7 @@
           <w:lang w:val="en-US"/>
         </w:rPr>
         <w:tab/>
-        <w:t xml:space="preserve">6 </w:t>
-      </w:r>
-      <w:proofErr w:type="spellStart"/>
-      <w:r>
-        <w:rPr>
-          <w:lang w:val="en-US"/>
-        </w:rPr>
-        <w:t>goto</w:t>
-      </w:r>
-      <w:proofErr w:type="spellEnd"/>
-      <w:r>
-        <w:rPr>
-          <w:lang w:val="en-US"/>
-        </w:rPr>
-        <w:t xml:space="preserve"> 1</w:t>
+        <w:t>6 goto 1</w:t>
       </w:r>
     </w:p>
     <w:p>
@@ -1404,21 +996,7 @@
           <w:lang w:val="en-US"/>
         </w:rPr>
         <w:tab/>
-        <w:t xml:space="preserve">3 </w:t>
-      </w:r>
-      <w:proofErr w:type="gramStart"/>
-      <w:r>
-        <w:rPr>
-          <w:lang w:val="en-US"/>
-        </w:rPr>
-        <w:t>shoot</w:t>
-      </w:r>
-      <w:proofErr w:type="gramEnd"/>
-      <w:r>
-        <w:rPr>
-          <w:lang w:val="en-US"/>
-        </w:rPr>
-        <w:t xml:space="preserve"> when in range</w:t>
+        <w:t>3 shoot when in range</w:t>
       </w:r>
     </w:p>
     <w:p>
@@ -1446,21 +1024,7 @@
           <w:lang w:val="en-US"/>
         </w:rPr>
         <w:tab/>
-        <w:t xml:space="preserve">5 </w:t>
-      </w:r>
-      <w:proofErr w:type="spellStart"/>
-      <w:r>
-        <w:rPr>
-          <w:lang w:val="en-US"/>
-        </w:rPr>
-        <w:t>goto</w:t>
-      </w:r>
-      <w:proofErr w:type="spellEnd"/>
-      <w:r>
-        <w:rPr>
-          <w:lang w:val="en-US"/>
-        </w:rPr>
-        <w:t xml:space="preserve"> 1</w:t>
+        <w:t>5 goto 1</w:t>
       </w:r>
     </w:p>
     <w:p>
@@ -1522,71 +1086,35 @@
           <w:lang w:val="en-US"/>
         </w:rPr>
         <w:tab/>
-        <w:t xml:space="preserve">2 </w:t>
-      </w:r>
-      <w:proofErr w:type="spellStart"/>
-      <w:r>
-        <w:rPr>
-          <w:lang w:val="en-US"/>
-        </w:rPr>
-        <w:t>telegraf</w:t>
-      </w:r>
-      <w:proofErr w:type="spellEnd"/>
-      <w:r>
-        <w:rPr>
-          <w:lang w:val="en-US"/>
-        </w:rPr>
-        <w:t xml:space="preserve"> bite</w:t>
-      </w:r>
-    </w:p>
-    <w:p>
-      <w:pPr>
-        <w:rPr>
-          <w:lang w:val="en-US"/>
-        </w:rPr>
-      </w:pPr>
-      <w:r>
-        <w:rPr>
-          <w:lang w:val="en-US"/>
-        </w:rPr>
-        <w:tab/>
-        <w:t xml:space="preserve">3 </w:t>
-      </w:r>
-      <w:proofErr w:type="gramStart"/>
-      <w:r>
-        <w:rPr>
-          <w:lang w:val="en-US"/>
-        </w:rPr>
-        <w:t>bite</w:t>
-      </w:r>
-      <w:proofErr w:type="gramEnd"/>
-    </w:p>
-    <w:p>
-      <w:pPr>
-        <w:rPr>
-          <w:lang w:val="en-US"/>
-        </w:rPr>
-      </w:pPr>
-      <w:r>
-        <w:rPr>
-          <w:lang w:val="en-US"/>
-        </w:rPr>
-        <w:tab/>
-        <w:t xml:space="preserve">4 </w:t>
-      </w:r>
-      <w:proofErr w:type="spellStart"/>
-      <w:r>
-        <w:rPr>
-          <w:lang w:val="en-US"/>
-        </w:rPr>
-        <w:t>goto</w:t>
-      </w:r>
-      <w:proofErr w:type="spellEnd"/>
-      <w:r>
-        <w:rPr>
-          <w:lang w:val="en-US"/>
-        </w:rPr>
-        <w:t xml:space="preserve"> 1</w:t>
+        <w:t>2 telegraf bite</w:t>
+      </w:r>
+    </w:p>
+    <w:p>
+      <w:pPr>
+        <w:rPr>
+          <w:lang w:val="en-US"/>
+        </w:rPr>
+      </w:pPr>
+      <w:r>
+        <w:rPr>
+          <w:lang w:val="en-US"/>
+        </w:rPr>
+        <w:tab/>
+        <w:t>3 bite</w:t>
+      </w:r>
+    </w:p>
+    <w:p>
+      <w:pPr>
+        <w:rPr>
+          <w:lang w:val="en-US"/>
+        </w:rPr>
+      </w:pPr>
+      <w:r>
+        <w:rPr>
+          <w:lang w:val="en-US"/>
+        </w:rPr>
+        <w:tab/>
+        <w:t>4 goto 1</w:t>
       </w:r>
     </w:p>
     <w:p>
@@ -1831,21 +1359,7 @@
           <w:lang w:val="en-US"/>
         </w:rPr>
         <w:tab/>
-        <w:t xml:space="preserve">- one light, (slash </w:t>
-      </w:r>
-      <w:proofErr w:type="spellStart"/>
-      <w:r>
-        <w:rPr>
-          <w:lang w:val="en-US"/>
-        </w:rPr>
-        <w:t>slash</w:t>
-      </w:r>
-      <w:proofErr w:type="spellEnd"/>
-      <w:r>
-        <w:rPr>
-          <w:lang w:val="en-US"/>
-        </w:rPr>
-        <w:t xml:space="preserve"> stab)</w:t>
+        <w:t>- one light, (slash slash stab)</w:t>
       </w:r>
     </w:p>
     <w:p>
@@ -1899,111 +1413,27 @@
           <w:lang w:val="en-US"/>
         </w:rPr>
         <w:tab/>
-        <w:t xml:space="preserve">- light, (pew </w:t>
-      </w:r>
-      <w:proofErr w:type="spellStart"/>
-      <w:r>
-        <w:rPr>
-          <w:lang w:val="en-US"/>
-        </w:rPr>
-        <w:t>pew</w:t>
-      </w:r>
-      <w:proofErr w:type="spellEnd"/>
-      <w:r>
-        <w:rPr>
-          <w:lang w:val="en-US"/>
-        </w:rPr>
-        <w:t xml:space="preserve"> </w:t>
-      </w:r>
-      <w:proofErr w:type="spellStart"/>
-      <w:r>
-        <w:rPr>
-          <w:lang w:val="en-US"/>
-        </w:rPr>
-        <w:t>pew</w:t>
-      </w:r>
-      <w:proofErr w:type="spellEnd"/>
-      <w:r>
-        <w:rPr>
-          <w:lang w:val="en-US"/>
-        </w:rPr>
-        <w:t xml:space="preserve">, mini cool down, pew </w:t>
-      </w:r>
-      <w:proofErr w:type="spellStart"/>
-      <w:r>
-        <w:rPr>
-          <w:lang w:val="en-US"/>
-        </w:rPr>
-        <w:t>pew</w:t>
-      </w:r>
-      <w:proofErr w:type="spellEnd"/>
-      <w:r>
-        <w:rPr>
-          <w:lang w:val="en-US"/>
-        </w:rPr>
-        <w:t xml:space="preserve"> </w:t>
-      </w:r>
-      <w:proofErr w:type="spellStart"/>
-      <w:r>
-        <w:rPr>
-          <w:lang w:val="en-US"/>
-        </w:rPr>
-        <w:t>pew</w:t>
-      </w:r>
-      <w:proofErr w:type="spellEnd"/>
-      <w:r>
-        <w:rPr>
-          <w:lang w:val="en-US"/>
-        </w:rPr>
-        <w:t xml:space="preserve"> ...)</w:t>
-      </w:r>
-    </w:p>
-    <w:p>
-      <w:pPr>
-        <w:rPr>
-          <w:lang w:val="en-US"/>
-        </w:rPr>
-      </w:pPr>
-      <w:r>
-        <w:rPr>
-          <w:lang w:val="en-US"/>
-        </w:rPr>
-        <w:tab/>
-      </w:r>
-      <w:r>
-        <w:rPr>
-          <w:lang w:val="en-US"/>
-        </w:rPr>
-        <w:tab/>
-        <w:t xml:space="preserve">- heavy, charges as long as pew </w:t>
-      </w:r>
-      <w:proofErr w:type="spellStart"/>
-      <w:r>
-        <w:rPr>
-          <w:lang w:val="en-US"/>
-        </w:rPr>
-        <w:t>pew</w:t>
-      </w:r>
-      <w:proofErr w:type="spellEnd"/>
-      <w:r>
-        <w:rPr>
-          <w:lang w:val="en-US"/>
-        </w:rPr>
-        <w:t xml:space="preserve"> </w:t>
-      </w:r>
-      <w:proofErr w:type="spellStart"/>
-      <w:r>
-        <w:rPr>
-          <w:lang w:val="en-US"/>
-        </w:rPr>
-        <w:t>pew</w:t>
-      </w:r>
-      <w:proofErr w:type="spellEnd"/>
-      <w:r>
-        <w:rPr>
-          <w:lang w:val="en-US"/>
-        </w:rPr>
-        <w:t xml:space="preserve"> + mini cooldown, but then shoots 5 at once then minibreak</w:t>
+        <w:t>- light, (pew pew pew, mini cool down, pew pew pew ...)</w:t>
+      </w:r>
+    </w:p>
+    <w:p>
+      <w:pPr>
+        <w:rPr>
+          <w:lang w:val="en-US"/>
+        </w:rPr>
+      </w:pPr>
+      <w:r>
+        <w:rPr>
+          <w:lang w:val="en-US"/>
+        </w:rPr>
+        <w:tab/>
+      </w:r>
+      <w:r>
+        <w:rPr>
+          <w:lang w:val="en-US"/>
+        </w:rPr>
+        <w:tab/>
+        <w:t>- heavy, charges as long as pew pew pew + mini cooldown, but then shoots 5 at once then minibreak</w:t>
       </w:r>
     </w:p>
     <w:p>
@@ -2201,21 +1631,7 @@
           <w:lang w:val="en-US"/>
         </w:rPr>
         <w:tab/>
-        <w:t xml:space="preserve">  outbreaks of monsters, but ultimately leading to a good ending, where </w:t>
-      </w:r>
-      <w:proofErr w:type="spellStart"/>
-      <w:r>
-        <w:rPr>
-          <w:lang w:val="en-US"/>
-        </w:rPr>
-        <w:t>hes</w:t>
-      </w:r>
-      <w:proofErr w:type="spellEnd"/>
-      <w:r>
-        <w:rPr>
-          <w:lang w:val="en-US"/>
-        </w:rPr>
-        <w:t xml:space="preserve"> not revived</w:t>
+        <w:t xml:space="preserve">  outbreaks of monsters, but ultimately leading to a good ending, where hes not revived</w:t>
       </w:r>
     </w:p>
     <w:p>
@@ -2283,21 +1699,7 @@
         <w:rPr>
           <w:lang w:val="en-US"/>
         </w:rPr>
-        <w:t xml:space="preserve">- first jungle item: whip, later to be upgraded to </w:t>
-      </w:r>
-      <w:proofErr w:type="spellStart"/>
-      <w:r>
-        <w:rPr>
-          <w:lang w:val="en-US"/>
-        </w:rPr>
-        <w:t>grapling</w:t>
-      </w:r>
-      <w:proofErr w:type="spellEnd"/>
-      <w:r>
-        <w:rPr>
-          <w:lang w:val="en-US"/>
-        </w:rPr>
-        <w:t xml:space="preserve"> hook. can pull things and stun enemies, </w:t>
+        <w:t xml:space="preserve">- first jungle item: whip, later to be upgraded to grapling hook. can pull things and stun enemies, </w:t>
       </w:r>
     </w:p>
     <w:p>
@@ -2385,19 +1787,11 @@
           <w:lang w:val="en-US"/>
         </w:rPr>
       </w:pPr>
-      <w:proofErr w:type="spellStart"/>
-      <w:r>
-        <w:rPr>
-          <w:lang w:val="en-US"/>
-        </w:rPr>
-        <w:t>beyblade</w:t>
-      </w:r>
-      <w:proofErr w:type="spellEnd"/>
-      <w:r>
-        <w:rPr>
-          <w:lang w:val="en-US"/>
-        </w:rPr>
-        <w:t>,</w:t>
+      <w:r>
+        <w:rPr>
+          <w:lang w:val="en-US"/>
+        </w:rPr>
+        <w:t>beyblade,</w:t>
       </w:r>
     </w:p>
     <w:p>
@@ -2419,60 +1813,24 @@
           <w:lang w:val="en-US"/>
         </w:rPr>
       </w:pPr>
-      <w:proofErr w:type="spellStart"/>
-      <w:r>
-        <w:rPr>
-          <w:lang w:val="en-US"/>
-        </w:rPr>
-        <w:t>grapling</w:t>
-      </w:r>
-      <w:proofErr w:type="spellEnd"/>
-      <w:r>
-        <w:rPr>
-          <w:lang w:val="en-US"/>
-        </w:rPr>
-        <w:t xml:space="preserve"> hook,</w:t>
-      </w:r>
-    </w:p>
-    <w:p>
-      <w:pPr>
-        <w:rPr>
-          <w:lang w:val="en-US"/>
-        </w:rPr>
-      </w:pPr>
-      <w:r>
-        <w:rPr>
-          <w:lang w:val="en-US"/>
-        </w:rPr>
-        <w:t xml:space="preserve">1 spell, (fire, </w:t>
-      </w:r>
-      <w:proofErr w:type="spellStart"/>
-      <w:r>
-        <w:rPr>
-          <w:lang w:val="en-US"/>
-        </w:rPr>
-        <w:t>tp</w:t>
-      </w:r>
-      <w:proofErr w:type="spellEnd"/>
-      <w:r>
-        <w:rPr>
-          <w:lang w:val="en-US"/>
-        </w:rPr>
-        <w:t>, ice</w:t>
-      </w:r>
-      <w:proofErr w:type="gramStart"/>
-      <w:r>
-        <w:rPr>
-          <w:lang w:val="en-US"/>
-        </w:rPr>
-        <w:t xml:space="preserve"> ..?</w:t>
-      </w:r>
-      <w:proofErr w:type="gramEnd"/>
-      <w:r>
-        <w:rPr>
-          <w:lang w:val="en-US"/>
-        </w:rPr>
-        <w:t>)</w:t>
+      <w:r>
+        <w:rPr>
+          <w:lang w:val="en-US"/>
+        </w:rPr>
+        <w:t>grapling hook,</w:t>
+      </w:r>
+    </w:p>
+    <w:p>
+      <w:pPr>
+        <w:rPr>
+          <w:lang w:val="en-US"/>
+        </w:rPr>
+      </w:pPr>
+      <w:r>
+        <w:rPr>
+          <w:lang w:val="en-US"/>
+        </w:rPr>
+        <w:t>1 spell, (fire, tp, ice ..?)</w:t>
       </w:r>
     </w:p>
     <w:p>
@@ -2537,21 +1895,7 @@
         <w:rPr>
           <w:lang w:val="en-US"/>
         </w:rPr>
-        <w:t xml:space="preserve">wind boots </w:t>
-      </w:r>
-      <w:proofErr w:type="gramStart"/>
-      <w:r>
-        <w:rPr>
-          <w:lang w:val="en-US"/>
-        </w:rPr>
-        <w:t>( dash</w:t>
-      </w:r>
-      <w:proofErr w:type="gramEnd"/>
-      <w:r>
-        <w:rPr>
-          <w:lang w:val="en-US"/>
-        </w:rPr>
-        <w:t xml:space="preserve">) </w:t>
+        <w:t xml:space="preserve">wind boots ( dash) </w:t>
       </w:r>
     </w:p>
     <w:p>

</xml_diff>

<commit_message>
update on design for blocking
</commit_message>
<xml_diff>
--- a/Misc/design.docx
+++ b/Misc/design.docx
@@ -114,7 +114,35 @@
         <w:rPr>
           <w:lang w:val="en-US"/>
         </w:rPr>
-        <w:t>Idea 1: directional shield with hp. Physical shield gets no damage from phys, but magic, Magical shield that gets no damage from magic but phys, players need to position accordingly against strong enemies, but weak is fine</w:t>
+        <w:t xml:space="preserve">Idea 1: directional shield with hp. Physical shield gets no damage from </w:t>
+      </w:r>
+      <w:proofErr w:type="spellStart"/>
+      <w:r>
+        <w:rPr>
+          <w:lang w:val="en-US"/>
+        </w:rPr>
+        <w:t>phys</w:t>
+      </w:r>
+      <w:proofErr w:type="spellEnd"/>
+      <w:r>
+        <w:rPr>
+          <w:lang w:val="en-US"/>
+        </w:rPr>
+        <w:t xml:space="preserve">, but magic, Magical shield that gets no damage from magic but </w:t>
+      </w:r>
+      <w:proofErr w:type="spellStart"/>
+      <w:r>
+        <w:rPr>
+          <w:lang w:val="en-US"/>
+        </w:rPr>
+        <w:t>phys</w:t>
+      </w:r>
+      <w:proofErr w:type="spellEnd"/>
+      <w:r>
+        <w:rPr>
+          <w:lang w:val="en-US"/>
+        </w:rPr>
+        <w:t>, players need to position accordingly against strong enemies, but weak is fine</w:t>
       </w:r>
       <w:r>
         <w:rPr>
@@ -173,6 +201,39 @@
         <w:rPr>
           <w:lang w:val="en-US"/>
         </w:rPr>
+        <w:t>Decision on blocking and dodging for now:</w:t>
+      </w:r>
+    </w:p>
+    <w:p>
+      <w:pPr>
+        <w:rPr>
+          <w:lang w:val="en-US"/>
+        </w:rPr>
+      </w:pPr>
+      <w:r>
+        <w:rPr>
+          <w:lang w:val="en-US"/>
+        </w:rPr>
+        <w:t>Leave dodge as is for now, make a block for both players that enters a defensive stance in a direction, no cool down, can move during block but slower, blocks all damage if direction is correct</w:t>
+      </w:r>
+    </w:p>
+    <w:p>
+      <w:pPr>
+        <w:rPr>
+          <w:lang w:val="en-US"/>
+        </w:rPr>
+      </w:pPr>
+    </w:p>
+    <w:p>
+      <w:pPr>
+        <w:rPr>
+          <w:lang w:val="en-US"/>
+        </w:rPr>
+      </w:pPr>
+      <w:r>
+        <w:rPr>
+          <w:lang w:val="en-US"/>
+        </w:rPr>
         <w:t>Enemies:</w:t>
       </w:r>
     </w:p>
@@ -189,11 +250,19 @@
           <w:lang w:val="en-US"/>
         </w:rPr>
       </w:pPr>
-      <w:r>
-        <w:rPr>
-          <w:lang w:val="en-US"/>
-        </w:rPr>
-        <w:t>Miniboss:</w:t>
+      <w:proofErr w:type="spellStart"/>
+      <w:r>
+        <w:rPr>
+          <w:lang w:val="en-US"/>
+        </w:rPr>
+        <w:t>Miniboss</w:t>
+      </w:r>
+      <w:proofErr w:type="spellEnd"/>
+      <w:r>
+        <w:rPr>
+          <w:lang w:val="en-US"/>
+        </w:rPr>
+        <w:t>:</w:t>
       </w:r>
     </w:p>
     <w:p>
@@ -390,35 +459,77 @@
           <w:lang w:val="en-US"/>
         </w:rPr>
         <w:tab/>
-        <w:t xml:space="preserve">  on random time and if blood dagger circle exist: goto 3</w:t>
-      </w:r>
-    </w:p>
-    <w:p>
-      <w:pPr>
-        <w:rPr>
-          <w:lang w:val="en-US"/>
-        </w:rPr>
-      </w:pPr>
-      <w:r>
-        <w:rPr>
-          <w:lang w:val="en-US"/>
-        </w:rPr>
-        <w:tab/>
-        <w:t>2 strafe closest player, goto 1 if too close,</w:t>
-      </w:r>
-    </w:p>
-    <w:p>
-      <w:pPr>
-        <w:rPr>
-          <w:lang w:val="en-US"/>
-        </w:rPr>
-      </w:pPr>
-      <w:r>
-        <w:rPr>
-          <w:lang w:val="en-US"/>
-        </w:rPr>
-        <w:tab/>
-        <w:t xml:space="preserve">  on random time and if blood dagger circle exist: goto 3,</w:t>
+        <w:t xml:space="preserve">  on random time and if blood dagger circle exist: </w:t>
+      </w:r>
+      <w:proofErr w:type="spellStart"/>
+      <w:r>
+        <w:rPr>
+          <w:lang w:val="en-US"/>
+        </w:rPr>
+        <w:t>goto</w:t>
+      </w:r>
+      <w:proofErr w:type="spellEnd"/>
+      <w:r>
+        <w:rPr>
+          <w:lang w:val="en-US"/>
+        </w:rPr>
+        <w:t xml:space="preserve"> 3</w:t>
+      </w:r>
+    </w:p>
+    <w:p>
+      <w:pPr>
+        <w:rPr>
+          <w:lang w:val="en-US"/>
+        </w:rPr>
+      </w:pPr>
+      <w:r>
+        <w:rPr>
+          <w:lang w:val="en-US"/>
+        </w:rPr>
+        <w:tab/>
+        <w:t xml:space="preserve">2 strafe closest player, </w:t>
+      </w:r>
+      <w:proofErr w:type="spellStart"/>
+      <w:r>
+        <w:rPr>
+          <w:lang w:val="en-US"/>
+        </w:rPr>
+        <w:t>goto</w:t>
+      </w:r>
+      <w:proofErr w:type="spellEnd"/>
+      <w:r>
+        <w:rPr>
+          <w:lang w:val="en-US"/>
+        </w:rPr>
+        <w:t xml:space="preserve"> 1 if too close,</w:t>
+      </w:r>
+    </w:p>
+    <w:p>
+      <w:pPr>
+        <w:rPr>
+          <w:lang w:val="en-US"/>
+        </w:rPr>
+      </w:pPr>
+      <w:r>
+        <w:rPr>
+          <w:lang w:val="en-US"/>
+        </w:rPr>
+        <w:tab/>
+        <w:t xml:space="preserve">  on random time and if blood dagger circle exist: </w:t>
+      </w:r>
+      <w:proofErr w:type="spellStart"/>
+      <w:r>
+        <w:rPr>
+          <w:lang w:val="en-US"/>
+        </w:rPr>
+        <w:t>goto</w:t>
+      </w:r>
+      <w:proofErr w:type="spellEnd"/>
+      <w:r>
+        <w:rPr>
+          <w:lang w:val="en-US"/>
+        </w:rPr>
+        <w:t xml:space="preserve"> 3,</w:t>
       </w:r>
     </w:p>
     <w:p>
@@ -446,21 +557,77 @@
           <w:lang w:val="en-US"/>
         </w:rPr>
         <w:tab/>
-        <w:t>3 telegraf, goto 4 or goto 1 if circling dagger chosen</w:t>
-      </w:r>
-    </w:p>
-    <w:p>
-      <w:pPr>
-        <w:rPr>
-          <w:lang w:val="en-US"/>
-        </w:rPr>
-      </w:pPr>
-      <w:r>
-        <w:rPr>
-          <w:lang w:val="en-US"/>
-        </w:rPr>
-        <w:tab/>
-        <w:t>4 attack, goto 1</w:t>
+        <w:t xml:space="preserve">3 </w:t>
+      </w:r>
+      <w:proofErr w:type="spellStart"/>
+      <w:r>
+        <w:rPr>
+          <w:lang w:val="en-US"/>
+        </w:rPr>
+        <w:t>telegraf</w:t>
+      </w:r>
+      <w:proofErr w:type="spellEnd"/>
+      <w:r>
+        <w:rPr>
+          <w:lang w:val="en-US"/>
+        </w:rPr>
+        <w:t xml:space="preserve">, </w:t>
+      </w:r>
+      <w:proofErr w:type="spellStart"/>
+      <w:r>
+        <w:rPr>
+          <w:lang w:val="en-US"/>
+        </w:rPr>
+        <w:t>goto</w:t>
+      </w:r>
+      <w:proofErr w:type="spellEnd"/>
+      <w:r>
+        <w:rPr>
+          <w:lang w:val="en-US"/>
+        </w:rPr>
+        <w:t xml:space="preserve"> 4 or </w:t>
+      </w:r>
+      <w:proofErr w:type="spellStart"/>
+      <w:r>
+        <w:rPr>
+          <w:lang w:val="en-US"/>
+        </w:rPr>
+        <w:t>goto</w:t>
+      </w:r>
+      <w:proofErr w:type="spellEnd"/>
+      <w:r>
+        <w:rPr>
+          <w:lang w:val="en-US"/>
+        </w:rPr>
+        <w:t xml:space="preserve"> 1 if circling dagger chosen</w:t>
+      </w:r>
+    </w:p>
+    <w:p>
+      <w:pPr>
+        <w:rPr>
+          <w:lang w:val="en-US"/>
+        </w:rPr>
+      </w:pPr>
+      <w:r>
+        <w:rPr>
+          <w:lang w:val="en-US"/>
+        </w:rPr>
+        <w:tab/>
+        <w:t xml:space="preserve">4 attack, </w:t>
+      </w:r>
+      <w:proofErr w:type="spellStart"/>
+      <w:r>
+        <w:rPr>
+          <w:lang w:val="en-US"/>
+        </w:rPr>
+        <w:t>goto</w:t>
+      </w:r>
+      <w:proofErr w:type="spellEnd"/>
+      <w:r>
+        <w:rPr>
+          <w:lang w:val="en-US"/>
+        </w:rPr>
+        <w:t xml:space="preserve"> 1</w:t>
       </w:r>
     </w:p>
     <w:p>
@@ -571,7 +738,49 @@
         <w:rPr>
           <w:lang w:val="en-US"/>
         </w:rPr>
-        <w:t>: hasShield +5, isTooClose: +5, isTooFar: set to 0</w:t>
+        <w:t xml:space="preserve">: </w:t>
+      </w:r>
+      <w:proofErr w:type="spellStart"/>
+      <w:r>
+        <w:rPr>
+          <w:lang w:val="en-US"/>
+        </w:rPr>
+        <w:t>hasShield</w:t>
+      </w:r>
+      <w:proofErr w:type="spellEnd"/>
+      <w:r>
+        <w:rPr>
+          <w:lang w:val="en-US"/>
+        </w:rPr>
+        <w:t xml:space="preserve"> +5, </w:t>
+      </w:r>
+      <w:proofErr w:type="spellStart"/>
+      <w:r>
+        <w:rPr>
+          <w:lang w:val="en-US"/>
+        </w:rPr>
+        <w:t>isTooClose</w:t>
+      </w:r>
+      <w:proofErr w:type="spellEnd"/>
+      <w:r>
+        <w:rPr>
+          <w:lang w:val="en-US"/>
+        </w:rPr>
+        <w:t xml:space="preserve">: +5, </w:t>
+      </w:r>
+      <w:proofErr w:type="spellStart"/>
+      <w:r>
+        <w:rPr>
+          <w:lang w:val="en-US"/>
+        </w:rPr>
+        <w:t>isTooFar</w:t>
+      </w:r>
+      <w:proofErr w:type="spellEnd"/>
+      <w:r>
+        <w:rPr>
+          <w:lang w:val="en-US"/>
+        </w:rPr>
+        <w:t>: set to 0</w:t>
       </w:r>
     </w:p>
     <w:p>
@@ -599,7 +808,63 @@
         <w:rPr>
           <w:lang w:val="en-US"/>
         </w:rPr>
-        <w:t>: isTooClose: +5, hasNoShield: +5, isFarEnough: -5, hasNoGoblin: set to 0</w:t>
+        <w:t xml:space="preserve">: </w:t>
+      </w:r>
+      <w:proofErr w:type="spellStart"/>
+      <w:r>
+        <w:rPr>
+          <w:lang w:val="en-US"/>
+        </w:rPr>
+        <w:t>isTooClose</w:t>
+      </w:r>
+      <w:proofErr w:type="spellEnd"/>
+      <w:r>
+        <w:rPr>
+          <w:lang w:val="en-US"/>
+        </w:rPr>
+        <w:t xml:space="preserve">: +5, </w:t>
+      </w:r>
+      <w:proofErr w:type="spellStart"/>
+      <w:r>
+        <w:rPr>
+          <w:lang w:val="en-US"/>
+        </w:rPr>
+        <w:t>hasNoShield</w:t>
+      </w:r>
+      <w:proofErr w:type="spellEnd"/>
+      <w:r>
+        <w:rPr>
+          <w:lang w:val="en-US"/>
+        </w:rPr>
+        <w:t xml:space="preserve">: +5, </w:t>
+      </w:r>
+      <w:proofErr w:type="spellStart"/>
+      <w:r>
+        <w:rPr>
+          <w:lang w:val="en-US"/>
+        </w:rPr>
+        <w:t>isFarEnough</w:t>
+      </w:r>
+      <w:proofErr w:type="spellEnd"/>
+      <w:r>
+        <w:rPr>
+          <w:lang w:val="en-US"/>
+        </w:rPr>
+        <w:t xml:space="preserve">: -5, </w:t>
+      </w:r>
+      <w:proofErr w:type="spellStart"/>
+      <w:r>
+        <w:rPr>
+          <w:lang w:val="en-US"/>
+        </w:rPr>
+        <w:t>hasNoGoblin</w:t>
+      </w:r>
+      <w:proofErr w:type="spellEnd"/>
+      <w:r>
+        <w:rPr>
+          <w:lang w:val="en-US"/>
+        </w:rPr>
+        <w:t>: set to 0</w:t>
       </w:r>
     </w:p>
     <w:p>
@@ -641,7 +906,49 @@
         <w:rPr>
           <w:lang w:val="en-US"/>
         </w:rPr>
-        <w:t>: TooCloseAndHasShield: +5, isFarEnough: +10, hasNoGoblin: +5</w:t>
+        <w:t xml:space="preserve">: </w:t>
+      </w:r>
+      <w:proofErr w:type="spellStart"/>
+      <w:r>
+        <w:rPr>
+          <w:lang w:val="en-US"/>
+        </w:rPr>
+        <w:t>TooCloseAndHasShield</w:t>
+      </w:r>
+      <w:proofErr w:type="spellEnd"/>
+      <w:r>
+        <w:rPr>
+          <w:lang w:val="en-US"/>
+        </w:rPr>
+        <w:t xml:space="preserve">: +5, </w:t>
+      </w:r>
+      <w:proofErr w:type="spellStart"/>
+      <w:r>
+        <w:rPr>
+          <w:lang w:val="en-US"/>
+        </w:rPr>
+        <w:t>isFarEnough</w:t>
+      </w:r>
+      <w:proofErr w:type="spellEnd"/>
+      <w:r>
+        <w:rPr>
+          <w:lang w:val="en-US"/>
+        </w:rPr>
+        <w:t xml:space="preserve">: +10, </w:t>
+      </w:r>
+      <w:proofErr w:type="spellStart"/>
+      <w:r>
+        <w:rPr>
+          <w:lang w:val="en-US"/>
+        </w:rPr>
+        <w:t>hasNoGoblin</w:t>
+      </w:r>
+      <w:proofErr w:type="spellEnd"/>
+      <w:r>
+        <w:rPr>
+          <w:lang w:val="en-US"/>
+        </w:rPr>
+        <w:t>: +5</w:t>
       </w:r>
     </w:p>
     <w:p>
@@ -683,7 +990,63 @@
         <w:rPr>
           <w:lang w:val="en-US"/>
         </w:rPr>
-        <w:t>: TooClose: -10, hasShield: +5, isFarEnough: +10, hasNoGoblin: set to 0</w:t>
+        <w:t xml:space="preserve">: </w:t>
+      </w:r>
+      <w:proofErr w:type="spellStart"/>
+      <w:r>
+        <w:rPr>
+          <w:lang w:val="en-US"/>
+        </w:rPr>
+        <w:t>TooClose</w:t>
+      </w:r>
+      <w:proofErr w:type="spellEnd"/>
+      <w:r>
+        <w:rPr>
+          <w:lang w:val="en-US"/>
+        </w:rPr>
+        <w:t xml:space="preserve">: -10, </w:t>
+      </w:r>
+      <w:proofErr w:type="spellStart"/>
+      <w:r>
+        <w:rPr>
+          <w:lang w:val="en-US"/>
+        </w:rPr>
+        <w:t>hasShield</w:t>
+      </w:r>
+      <w:proofErr w:type="spellEnd"/>
+      <w:r>
+        <w:rPr>
+          <w:lang w:val="en-US"/>
+        </w:rPr>
+        <w:t xml:space="preserve">: +5, </w:t>
+      </w:r>
+      <w:proofErr w:type="spellStart"/>
+      <w:r>
+        <w:rPr>
+          <w:lang w:val="en-US"/>
+        </w:rPr>
+        <w:t>isFarEnough</w:t>
+      </w:r>
+      <w:proofErr w:type="spellEnd"/>
+      <w:r>
+        <w:rPr>
+          <w:lang w:val="en-US"/>
+        </w:rPr>
+        <w:t xml:space="preserve">: +10, </w:t>
+      </w:r>
+      <w:proofErr w:type="spellStart"/>
+      <w:r>
+        <w:rPr>
+          <w:lang w:val="en-US"/>
+        </w:rPr>
+        <w:t>hasNoGoblin</w:t>
+      </w:r>
+      <w:proofErr w:type="spellEnd"/>
+      <w:r>
+        <w:rPr>
+          <w:lang w:val="en-US"/>
+        </w:rPr>
+        <w:t>: set to 0</w:t>
       </w:r>
     </w:p>
     <w:p>
@@ -697,6 +1060,7 @@
         <w:rPr>
           <w:lang w:val="en-US"/>
         </w:rPr>
+        <w:lastRenderedPageBreak/>
         <w:t xml:space="preserve">- </w:t>
       </w:r>
       <w:r>
@@ -739,7 +1103,63 @@
         <w:rPr>
           <w:lang w:val="en-US"/>
         </w:rPr>
-        <w:t>: TooClose: -10, hasShield: +5, isFarEnough: +10, hasNoGoblin: set to 0</w:t>
+        <w:t xml:space="preserve">: </w:t>
+      </w:r>
+      <w:proofErr w:type="spellStart"/>
+      <w:r>
+        <w:rPr>
+          <w:lang w:val="en-US"/>
+        </w:rPr>
+        <w:t>TooClose</w:t>
+      </w:r>
+      <w:proofErr w:type="spellEnd"/>
+      <w:r>
+        <w:rPr>
+          <w:lang w:val="en-US"/>
+        </w:rPr>
+        <w:t xml:space="preserve">: -10, </w:t>
+      </w:r>
+      <w:proofErr w:type="spellStart"/>
+      <w:r>
+        <w:rPr>
+          <w:lang w:val="en-US"/>
+        </w:rPr>
+        <w:t>hasShield</w:t>
+      </w:r>
+      <w:proofErr w:type="spellEnd"/>
+      <w:r>
+        <w:rPr>
+          <w:lang w:val="en-US"/>
+        </w:rPr>
+        <w:t xml:space="preserve">: +5, </w:t>
+      </w:r>
+      <w:proofErr w:type="spellStart"/>
+      <w:r>
+        <w:rPr>
+          <w:lang w:val="en-US"/>
+        </w:rPr>
+        <w:t>isFarEnough</w:t>
+      </w:r>
+      <w:proofErr w:type="spellEnd"/>
+      <w:r>
+        <w:rPr>
+          <w:lang w:val="en-US"/>
+        </w:rPr>
+        <w:t xml:space="preserve">: +10, </w:t>
+      </w:r>
+      <w:proofErr w:type="spellStart"/>
+      <w:r>
+        <w:rPr>
+          <w:lang w:val="en-US"/>
+        </w:rPr>
+        <w:t>hasNoGoblin</w:t>
+      </w:r>
+      <w:proofErr w:type="spellEnd"/>
+      <w:r>
+        <w:rPr>
+          <w:lang w:val="en-US"/>
+        </w:rPr>
+        <w:t>: set to 0</w:t>
       </w:r>
     </w:p>
     <w:p>
@@ -777,11 +1197,47 @@
         </w:rPr>
         <w:t xml:space="preserve">: </w:t>
       </w:r>
-      <w:r>
-        <w:rPr>
-          <w:lang w:val="en-US"/>
-        </w:rPr>
-        <w:t>TooClose: -5, isFarEnough: +10, HasNoShield: +10,  hasShield: set to 0</w:t>
+      <w:proofErr w:type="spellStart"/>
+      <w:r>
+        <w:rPr>
+          <w:lang w:val="en-US"/>
+        </w:rPr>
+        <w:t>TooClose</w:t>
+      </w:r>
+      <w:proofErr w:type="spellEnd"/>
+      <w:r>
+        <w:rPr>
+          <w:lang w:val="en-US"/>
+        </w:rPr>
+        <w:t xml:space="preserve">: -5, </w:t>
+      </w:r>
+      <w:proofErr w:type="spellStart"/>
+      <w:r>
+        <w:rPr>
+          <w:lang w:val="en-US"/>
+        </w:rPr>
+        <w:t>isFarEnough</w:t>
+      </w:r>
+      <w:proofErr w:type="spellEnd"/>
+      <w:r>
+        <w:rPr>
+          <w:lang w:val="en-US"/>
+        </w:rPr>
+        <w:t xml:space="preserve">: +10, HasNoShield: +10,  </w:t>
+      </w:r>
+      <w:proofErr w:type="spellStart"/>
+      <w:r>
+        <w:rPr>
+          <w:lang w:val="en-US"/>
+        </w:rPr>
+        <w:t>hasShield</w:t>
+      </w:r>
+      <w:proofErr w:type="spellEnd"/>
+      <w:r>
+        <w:rPr>
+          <w:lang w:val="en-US"/>
+        </w:rPr>
+        <w:t>: set to 0</w:t>
       </w:r>
     </w:p>
     <w:p>
@@ -814,7 +1270,6 @@
         <w:rPr>
           <w:lang w:val="en-US"/>
         </w:rPr>
-        <w:lastRenderedPageBreak/>
         <w:tab/>
         <w:t>1 walk up to nearest player</w:t>
       </w:r>
@@ -844,8 +1299,16 @@
           <w:lang w:val="en-US"/>
         </w:rPr>
         <w:tab/>
-        <w:t>3 telegraf</w:t>
-      </w:r>
+        <w:t xml:space="preserve">3 </w:t>
+      </w:r>
+      <w:proofErr w:type="spellStart"/>
+      <w:r>
+        <w:rPr>
+          <w:lang w:val="en-US"/>
+        </w:rPr>
+        <w:t>telegraf</w:t>
+      </w:r>
+      <w:proofErr w:type="spellEnd"/>
     </w:p>
     <w:p>
       <w:pPr>
@@ -906,7 +1369,21 @@
           <w:lang w:val="en-US"/>
         </w:rPr>
         <w:tab/>
-        <w:t>6 goto 1</w:t>
+        <w:t xml:space="preserve">6 </w:t>
+      </w:r>
+      <w:proofErr w:type="spellStart"/>
+      <w:r>
+        <w:rPr>
+          <w:lang w:val="en-US"/>
+        </w:rPr>
+        <w:t>goto</w:t>
+      </w:r>
+      <w:proofErr w:type="spellEnd"/>
+      <w:r>
+        <w:rPr>
+          <w:lang w:val="en-US"/>
+        </w:rPr>
+        <w:t xml:space="preserve"> 1</w:t>
       </w:r>
     </w:p>
     <w:p>
@@ -1024,7 +1501,21 @@
           <w:lang w:val="en-US"/>
         </w:rPr>
         <w:tab/>
-        <w:t>5 goto 1</w:t>
+        <w:t xml:space="preserve">5 </w:t>
+      </w:r>
+      <w:proofErr w:type="spellStart"/>
+      <w:r>
+        <w:rPr>
+          <w:lang w:val="en-US"/>
+        </w:rPr>
+        <w:t>goto</w:t>
+      </w:r>
+      <w:proofErr w:type="spellEnd"/>
+      <w:r>
+        <w:rPr>
+          <w:lang w:val="en-US"/>
+        </w:rPr>
+        <w:t xml:space="preserve"> 1</w:t>
       </w:r>
     </w:p>
     <w:p>
@@ -1086,7 +1577,21 @@
           <w:lang w:val="en-US"/>
         </w:rPr>
         <w:tab/>
-        <w:t>2 telegraf bite</w:t>
+        <w:t xml:space="preserve">2 </w:t>
+      </w:r>
+      <w:proofErr w:type="spellStart"/>
+      <w:r>
+        <w:rPr>
+          <w:lang w:val="en-US"/>
+        </w:rPr>
+        <w:t>telegraf</w:t>
+      </w:r>
+      <w:proofErr w:type="spellEnd"/>
+      <w:r>
+        <w:rPr>
+          <w:lang w:val="en-US"/>
+        </w:rPr>
+        <w:t xml:space="preserve"> bite</w:t>
       </w:r>
     </w:p>
     <w:p>
@@ -1114,7 +1619,21 @@
           <w:lang w:val="en-US"/>
         </w:rPr>
         <w:tab/>
-        <w:t>4 goto 1</w:t>
+        <w:t xml:space="preserve">4 </w:t>
+      </w:r>
+      <w:proofErr w:type="spellStart"/>
+      <w:r>
+        <w:rPr>
+          <w:lang w:val="en-US"/>
+        </w:rPr>
+        <w:t>goto</w:t>
+      </w:r>
+      <w:proofErr w:type="spellEnd"/>
+      <w:r>
+        <w:rPr>
+          <w:lang w:val="en-US"/>
+        </w:rPr>
+        <w:t xml:space="preserve"> 1</w:t>
       </w:r>
     </w:p>
     <w:p>
@@ -1359,7 +1878,21 @@
           <w:lang w:val="en-US"/>
         </w:rPr>
         <w:tab/>
-        <w:t>- one light, (slash slash stab)</w:t>
+        <w:t xml:space="preserve">- one light, (slash </w:t>
+      </w:r>
+      <w:proofErr w:type="spellStart"/>
+      <w:r>
+        <w:rPr>
+          <w:lang w:val="en-US"/>
+        </w:rPr>
+        <w:t>slash</w:t>
+      </w:r>
+      <w:proofErr w:type="spellEnd"/>
+      <w:r>
+        <w:rPr>
+          <w:lang w:val="en-US"/>
+        </w:rPr>
+        <w:t xml:space="preserve"> stab)</w:t>
       </w:r>
     </w:p>
     <w:p>
@@ -1413,27 +1946,111 @@
           <w:lang w:val="en-US"/>
         </w:rPr>
         <w:tab/>
-        <w:t>- light, (pew pew pew, mini cool down, pew pew pew ...)</w:t>
-      </w:r>
-    </w:p>
-    <w:p>
-      <w:pPr>
-        <w:rPr>
-          <w:lang w:val="en-US"/>
-        </w:rPr>
-      </w:pPr>
-      <w:r>
-        <w:rPr>
-          <w:lang w:val="en-US"/>
-        </w:rPr>
-        <w:tab/>
-      </w:r>
-      <w:r>
-        <w:rPr>
-          <w:lang w:val="en-US"/>
-        </w:rPr>
-        <w:tab/>
-        <w:t>- heavy, charges as long as pew pew pew + mini cooldown, but then shoots 5 at once then minibreak</w:t>
+        <w:t xml:space="preserve">- light, (pew </w:t>
+      </w:r>
+      <w:proofErr w:type="spellStart"/>
+      <w:r>
+        <w:rPr>
+          <w:lang w:val="en-US"/>
+        </w:rPr>
+        <w:t>pew</w:t>
+      </w:r>
+      <w:proofErr w:type="spellEnd"/>
+      <w:r>
+        <w:rPr>
+          <w:lang w:val="en-US"/>
+        </w:rPr>
+        <w:t xml:space="preserve"> </w:t>
+      </w:r>
+      <w:proofErr w:type="spellStart"/>
+      <w:r>
+        <w:rPr>
+          <w:lang w:val="en-US"/>
+        </w:rPr>
+        <w:t>pew</w:t>
+      </w:r>
+      <w:proofErr w:type="spellEnd"/>
+      <w:r>
+        <w:rPr>
+          <w:lang w:val="en-US"/>
+        </w:rPr>
+        <w:t xml:space="preserve">, mini cool down, pew </w:t>
+      </w:r>
+      <w:proofErr w:type="spellStart"/>
+      <w:r>
+        <w:rPr>
+          <w:lang w:val="en-US"/>
+        </w:rPr>
+        <w:t>pew</w:t>
+      </w:r>
+      <w:proofErr w:type="spellEnd"/>
+      <w:r>
+        <w:rPr>
+          <w:lang w:val="en-US"/>
+        </w:rPr>
+        <w:t xml:space="preserve"> </w:t>
+      </w:r>
+      <w:proofErr w:type="spellStart"/>
+      <w:r>
+        <w:rPr>
+          <w:lang w:val="en-US"/>
+        </w:rPr>
+        <w:t>pew</w:t>
+      </w:r>
+      <w:proofErr w:type="spellEnd"/>
+      <w:r>
+        <w:rPr>
+          <w:lang w:val="en-US"/>
+        </w:rPr>
+        <w:t xml:space="preserve"> ...)</w:t>
+      </w:r>
+    </w:p>
+    <w:p>
+      <w:pPr>
+        <w:rPr>
+          <w:lang w:val="en-US"/>
+        </w:rPr>
+      </w:pPr>
+      <w:r>
+        <w:rPr>
+          <w:lang w:val="en-US"/>
+        </w:rPr>
+        <w:tab/>
+      </w:r>
+      <w:r>
+        <w:rPr>
+          <w:lang w:val="en-US"/>
+        </w:rPr>
+        <w:tab/>
+        <w:t xml:space="preserve">- heavy, charges as long as pew </w:t>
+      </w:r>
+      <w:proofErr w:type="spellStart"/>
+      <w:r>
+        <w:rPr>
+          <w:lang w:val="en-US"/>
+        </w:rPr>
+        <w:t>pew</w:t>
+      </w:r>
+      <w:proofErr w:type="spellEnd"/>
+      <w:r>
+        <w:rPr>
+          <w:lang w:val="en-US"/>
+        </w:rPr>
+        <w:t xml:space="preserve"> </w:t>
+      </w:r>
+      <w:proofErr w:type="spellStart"/>
+      <w:r>
+        <w:rPr>
+          <w:lang w:val="en-US"/>
+        </w:rPr>
+        <w:t>pew</w:t>
+      </w:r>
+      <w:proofErr w:type="spellEnd"/>
+      <w:r>
+        <w:rPr>
+          <w:lang w:val="en-US"/>
+        </w:rPr>
+        <w:t xml:space="preserve"> + mini cooldown, but then shoots 5 at once then minibreak</w:t>
       </w:r>
     </w:p>
     <w:p>
@@ -1631,7 +2248,21 @@
           <w:lang w:val="en-US"/>
         </w:rPr>
         <w:tab/>
-        <w:t xml:space="preserve">  outbreaks of monsters, but ultimately leading to a good ending, where hes not revived</w:t>
+        <w:t xml:space="preserve">  outbreaks of monsters, but ultimately leading to a good ending, where </w:t>
+      </w:r>
+      <w:proofErr w:type="spellStart"/>
+      <w:r>
+        <w:rPr>
+          <w:lang w:val="en-US"/>
+        </w:rPr>
+        <w:t>hes</w:t>
+      </w:r>
+      <w:proofErr w:type="spellEnd"/>
+      <w:r>
+        <w:rPr>
+          <w:lang w:val="en-US"/>
+        </w:rPr>
+        <w:t xml:space="preserve"> not revived</w:t>
       </w:r>
     </w:p>
     <w:p>
@@ -1699,7 +2330,21 @@
         <w:rPr>
           <w:lang w:val="en-US"/>
         </w:rPr>
-        <w:t xml:space="preserve">- first jungle item: whip, later to be upgraded to grapling hook. can pull things and stun enemies, </w:t>
+        <w:t xml:space="preserve">- first jungle item: whip, later to be upgraded to </w:t>
+      </w:r>
+      <w:proofErr w:type="spellStart"/>
+      <w:r>
+        <w:rPr>
+          <w:lang w:val="en-US"/>
+        </w:rPr>
+        <w:t>grapling</w:t>
+      </w:r>
+      <w:proofErr w:type="spellEnd"/>
+      <w:r>
+        <w:rPr>
+          <w:lang w:val="en-US"/>
+        </w:rPr>
+        <w:t xml:space="preserve"> hook. can pull things and stun enemies, </w:t>
       </w:r>
     </w:p>
     <w:p>
@@ -1787,11 +2432,19 @@
           <w:lang w:val="en-US"/>
         </w:rPr>
       </w:pPr>
-      <w:r>
-        <w:rPr>
-          <w:lang w:val="en-US"/>
-        </w:rPr>
-        <w:t>beyblade,</w:t>
+      <w:proofErr w:type="spellStart"/>
+      <w:r>
+        <w:rPr>
+          <w:lang w:val="en-US"/>
+        </w:rPr>
+        <w:t>beyblade</w:t>
+      </w:r>
+      <w:proofErr w:type="spellEnd"/>
+      <w:r>
+        <w:rPr>
+          <w:lang w:val="en-US"/>
+        </w:rPr>
+        <w:t>,</w:t>
       </w:r>
     </w:p>
     <w:p>
@@ -1813,24 +2466,46 @@
           <w:lang w:val="en-US"/>
         </w:rPr>
       </w:pPr>
-      <w:r>
-        <w:rPr>
-          <w:lang w:val="en-US"/>
-        </w:rPr>
-        <w:t>grapling hook,</w:t>
-      </w:r>
-    </w:p>
-    <w:p>
-      <w:pPr>
-        <w:rPr>
-          <w:lang w:val="en-US"/>
-        </w:rPr>
-      </w:pPr>
-      <w:r>
-        <w:rPr>
-          <w:lang w:val="en-US"/>
-        </w:rPr>
-        <w:t>1 spell, (fire, tp, ice ..?)</w:t>
+      <w:proofErr w:type="spellStart"/>
+      <w:r>
+        <w:rPr>
+          <w:lang w:val="en-US"/>
+        </w:rPr>
+        <w:t>grapling</w:t>
+      </w:r>
+      <w:proofErr w:type="spellEnd"/>
+      <w:r>
+        <w:rPr>
+          <w:lang w:val="en-US"/>
+        </w:rPr>
+        <w:t xml:space="preserve"> hook,</w:t>
+      </w:r>
+    </w:p>
+    <w:p>
+      <w:pPr>
+        <w:rPr>
+          <w:lang w:val="en-US"/>
+        </w:rPr>
+      </w:pPr>
+      <w:r>
+        <w:rPr>
+          <w:lang w:val="en-US"/>
+        </w:rPr>
+        <w:t xml:space="preserve">1 spell, (fire, </w:t>
+      </w:r>
+      <w:proofErr w:type="spellStart"/>
+      <w:r>
+        <w:rPr>
+          <w:lang w:val="en-US"/>
+        </w:rPr>
+        <w:t>tp</w:t>
+      </w:r>
+      <w:proofErr w:type="spellEnd"/>
+      <w:r>
+        <w:rPr>
+          <w:lang w:val="en-US"/>
+        </w:rPr>
+        <w:t>, ice ..?)</w:t>
       </w:r>
     </w:p>
     <w:p>

</xml_diff>